<commit_message>
Docu fini et diagramme
</commit_message>
<xml_diff>
--- a/Competition/Summer_2024/Documentation/CCI_2024_3_documentation.docx
+++ b/Competition/Summer_2024/Documentation/CCI_2024_3_documentation.docx
@@ -5,7 +5,7 @@
     <w:p>
       <w:pPr>
         <w:rPr>
-          <w:rStyle w:val="Hyperlink"/>
+          <w:rStyle w:val="Lienhypertexte"/>
         </w:rPr>
       </w:pPr>
     </w:p>
@@ -391,17 +391,17 @@
     <w:p/>
     <w:p>
       <w:pPr>
-        <w:pStyle w:val="Title"/>
-      </w:pPr>
-    </w:p>
-    <w:p>
-      <w:pPr>
-        <w:pStyle w:val="Title"/>
-      </w:pPr>
-    </w:p>
-    <w:p>
-      <w:pPr>
-        <w:pStyle w:val="Title"/>
+        <w:pStyle w:val="Titre"/>
+      </w:pPr>
+    </w:p>
+    <w:p>
+      <w:pPr>
+        <w:pStyle w:val="Titre"/>
+      </w:pPr>
+    </w:p>
+    <w:p>
+      <w:pPr>
+        <w:pStyle w:val="Titre"/>
       </w:pPr>
       <w:r>
         <w:t>Documentation</w:t>
@@ -414,13 +414,7 @@
         <w:jc w:val="center"/>
       </w:pPr>
       <w:r>
-        <w:t>[</w:t>
-      </w:r>
-      <w:r>
-        <w:t>Nom de votre projet</w:t>
-      </w:r>
-      <w:r>
-        <w:t>]</w:t>
+        <w:t>The Hacker Mouse</w:t>
       </w:r>
     </w:p>
     <w:p>
@@ -462,7 +456,10 @@
         <w:jc w:val="center"/>
       </w:pPr>
       <w:r>
-        <w:t>Équipe #[numéro],</w:t>
+        <w:t>Équipe </w:t>
+      </w:r>
+      <w:r>
+        <w:t>#3</w:t>
       </w:r>
     </w:p>
     <w:p>
@@ -470,7 +467,7 @@
         <w:jc w:val="center"/>
       </w:pPr>
       <w:r>
-        <w:t>[Participant 1]</w:t>
+        <w:t>Francis Gratton</w:t>
       </w:r>
     </w:p>
     <w:p>
@@ -478,7 +475,7 @@
         <w:jc w:val="center"/>
       </w:pPr>
       <w:r>
-        <w:t>[Participant 2]</w:t>
+        <w:t>Jonathan Migner</w:t>
       </w:r>
     </w:p>
     <w:p>
@@ -556,7 +553,7 @@
     <w:p/>
     <w:p>
       <w:pPr>
-        <w:pStyle w:val="TOC1"/>
+        <w:pStyle w:val="TM1"/>
         <w:tabs>
           <w:tab w:val="left" w:pos="480"/>
           <w:tab w:val="right" w:leader="dot" w:pos="9350"/>
@@ -581,7 +578,7 @@
       <w:hyperlink w:anchor="_Toc174639041" w:history="1">
         <w:r>
           <w:rPr>
-            <w:rStyle w:val="Hyperlink"/>
+            <w:rStyle w:val="Lienhypertexte"/>
             <w:rFonts w:eastAsiaTheme="majorEastAsia"/>
             <w:noProof/>
           </w:rPr>
@@ -599,7 +596,7 @@
         </w:r>
         <w:r>
           <w:rPr>
-            <w:rStyle w:val="Hyperlink"/>
+            <w:rStyle w:val="Lienhypertexte"/>
             <w:rFonts w:eastAsiaTheme="majorEastAsia"/>
             <w:noProof/>
           </w:rPr>
@@ -657,7 +654,7 @@
     </w:p>
     <w:p>
       <w:pPr>
-        <w:pStyle w:val="TOC2"/>
+        <w:pStyle w:val="TM2"/>
         <w:tabs>
           <w:tab w:val="left" w:pos="960"/>
           <w:tab w:val="right" w:leader="dot" w:pos="9350"/>
@@ -673,7 +670,7 @@
       <w:hyperlink w:anchor="_Toc174639042" w:history="1">
         <w:r>
           <w:rPr>
-            <w:rStyle w:val="Hyperlink"/>
+            <w:rStyle w:val="Lienhypertexte"/>
             <w:rFonts w:eastAsiaTheme="majorEastAsia"/>
             <w:noProof/>
           </w:rPr>
@@ -691,7 +688,7 @@
         </w:r>
         <w:r>
           <w:rPr>
-            <w:rStyle w:val="Hyperlink"/>
+            <w:rStyle w:val="Lienhypertexte"/>
             <w:rFonts w:eastAsiaTheme="majorEastAsia"/>
             <w:noProof/>
           </w:rPr>
@@ -749,7 +746,7 @@
     </w:p>
     <w:p>
       <w:pPr>
-        <w:pStyle w:val="TOC2"/>
+        <w:pStyle w:val="TM2"/>
         <w:tabs>
           <w:tab w:val="left" w:pos="960"/>
           <w:tab w:val="right" w:leader="dot" w:pos="9350"/>
@@ -765,7 +762,7 @@
       <w:hyperlink w:anchor="_Toc174639043" w:history="1">
         <w:r>
           <w:rPr>
-            <w:rStyle w:val="Hyperlink"/>
+            <w:rStyle w:val="Lienhypertexte"/>
             <w:rFonts w:eastAsiaTheme="majorEastAsia"/>
             <w:noProof/>
           </w:rPr>
@@ -783,7 +780,7 @@
         </w:r>
         <w:r>
           <w:rPr>
-            <w:rStyle w:val="Hyperlink"/>
+            <w:rStyle w:val="Lienhypertexte"/>
             <w:rFonts w:eastAsiaTheme="majorEastAsia"/>
             <w:noProof/>
           </w:rPr>
@@ -841,7 +838,7 @@
     </w:p>
     <w:p>
       <w:pPr>
-        <w:pStyle w:val="TOC3"/>
+        <w:pStyle w:val="TM3"/>
         <w:tabs>
           <w:tab w:val="left" w:pos="1440"/>
           <w:tab w:val="right" w:leader="dot" w:pos="9350"/>
@@ -857,7 +854,7 @@
       <w:hyperlink w:anchor="_Toc174639044" w:history="1">
         <w:r>
           <w:rPr>
-            <w:rStyle w:val="Hyperlink"/>
+            <w:rStyle w:val="Lienhypertexte"/>
             <w:rFonts w:eastAsiaTheme="majorEastAsia"/>
             <w:noProof/>
           </w:rPr>
@@ -875,7 +872,7 @@
         </w:r>
         <w:r>
           <w:rPr>
-            <w:rStyle w:val="Hyperlink"/>
+            <w:rStyle w:val="Lienhypertexte"/>
             <w:rFonts w:eastAsiaTheme="majorEastAsia"/>
             <w:noProof/>
           </w:rPr>
@@ -933,7 +930,7 @@
     </w:p>
     <w:p>
       <w:pPr>
-        <w:pStyle w:val="TOC3"/>
+        <w:pStyle w:val="TM3"/>
         <w:tabs>
           <w:tab w:val="left" w:pos="1440"/>
           <w:tab w:val="right" w:leader="dot" w:pos="9350"/>
@@ -949,7 +946,7 @@
       <w:hyperlink w:anchor="_Toc174639045" w:history="1">
         <w:r>
           <w:rPr>
-            <w:rStyle w:val="Hyperlink"/>
+            <w:rStyle w:val="Lienhypertexte"/>
             <w:rFonts w:eastAsiaTheme="majorEastAsia"/>
             <w:noProof/>
           </w:rPr>
@@ -967,7 +964,7 @@
         </w:r>
         <w:r>
           <w:rPr>
-            <w:rStyle w:val="Hyperlink"/>
+            <w:rStyle w:val="Lienhypertexte"/>
             <w:rFonts w:eastAsiaTheme="majorEastAsia"/>
             <w:noProof/>
           </w:rPr>
@@ -1025,7 +1022,7 @@
     </w:p>
     <w:p>
       <w:pPr>
-        <w:pStyle w:val="TOC2"/>
+        <w:pStyle w:val="TM2"/>
         <w:tabs>
           <w:tab w:val="left" w:pos="960"/>
           <w:tab w:val="right" w:leader="dot" w:pos="9350"/>
@@ -1041,7 +1038,7 @@
       <w:hyperlink w:anchor="_Toc174639046" w:history="1">
         <w:r>
           <w:rPr>
-            <w:rStyle w:val="Hyperlink"/>
+            <w:rStyle w:val="Lienhypertexte"/>
             <w:rFonts w:eastAsiaTheme="majorEastAsia"/>
             <w:noProof/>
           </w:rPr>
@@ -1059,7 +1056,7 @@
         </w:r>
         <w:r>
           <w:rPr>
-            <w:rStyle w:val="Hyperlink"/>
+            <w:rStyle w:val="Lienhypertexte"/>
             <w:rFonts w:eastAsiaTheme="majorEastAsia"/>
             <w:noProof/>
           </w:rPr>
@@ -1117,7 +1114,7 @@
     </w:p>
     <w:p>
       <w:pPr>
-        <w:pStyle w:val="TOC3"/>
+        <w:pStyle w:val="TM3"/>
         <w:tabs>
           <w:tab w:val="left" w:pos="1440"/>
           <w:tab w:val="right" w:leader="dot" w:pos="9350"/>
@@ -1133,7 +1130,7 @@
       <w:hyperlink w:anchor="_Toc174639047" w:history="1">
         <w:r>
           <w:rPr>
-            <w:rStyle w:val="Hyperlink"/>
+            <w:rStyle w:val="Lienhypertexte"/>
             <w:rFonts w:eastAsiaTheme="majorEastAsia"/>
             <w:noProof/>
           </w:rPr>
@@ -1151,7 +1148,7 @@
         </w:r>
         <w:r>
           <w:rPr>
-            <w:rStyle w:val="Hyperlink"/>
+            <w:rStyle w:val="Lienhypertexte"/>
             <w:rFonts w:eastAsiaTheme="majorEastAsia"/>
             <w:noProof/>
           </w:rPr>
@@ -1209,7 +1206,7 @@
     </w:p>
     <w:p>
       <w:pPr>
-        <w:pStyle w:val="TOC1"/>
+        <w:pStyle w:val="TM1"/>
         <w:tabs>
           <w:tab w:val="left" w:pos="480"/>
           <w:tab w:val="right" w:leader="dot" w:pos="9350"/>
@@ -1225,7 +1222,7 @@
       <w:hyperlink w:anchor="_Toc174639048" w:history="1">
         <w:r>
           <w:rPr>
-            <w:rStyle w:val="Hyperlink"/>
+            <w:rStyle w:val="Lienhypertexte"/>
             <w:rFonts w:eastAsiaTheme="majorEastAsia"/>
             <w:noProof/>
           </w:rPr>
@@ -1243,7 +1240,7 @@
         </w:r>
         <w:r>
           <w:rPr>
-            <w:rStyle w:val="Hyperlink"/>
+            <w:rStyle w:val="Lienhypertexte"/>
             <w:rFonts w:eastAsiaTheme="majorEastAsia"/>
             <w:noProof/>
           </w:rPr>
@@ -1288,7 +1285,7 @@
             <w:noProof/>
             <w:webHidden/>
           </w:rPr>
-          <w:t>4</w:t>
+          <w:t>5</w:t>
         </w:r>
         <w:r>
           <w:rPr>
@@ -1301,7 +1298,7 @@
     </w:p>
     <w:p>
       <w:pPr>
-        <w:pStyle w:val="TOC2"/>
+        <w:pStyle w:val="TM2"/>
         <w:tabs>
           <w:tab w:val="left" w:pos="960"/>
           <w:tab w:val="right" w:leader="dot" w:pos="9350"/>
@@ -1317,7 +1314,7 @@
       <w:hyperlink w:anchor="_Toc174639049" w:history="1">
         <w:r>
           <w:rPr>
-            <w:rStyle w:val="Hyperlink"/>
+            <w:rStyle w:val="Lienhypertexte"/>
             <w:rFonts w:eastAsiaTheme="majorEastAsia"/>
             <w:noProof/>
           </w:rPr>
@@ -1335,7 +1332,7 @@
         </w:r>
         <w:r>
           <w:rPr>
-            <w:rStyle w:val="Hyperlink"/>
+            <w:rStyle w:val="Lienhypertexte"/>
             <w:rFonts w:eastAsiaTheme="majorEastAsia"/>
             <w:noProof/>
           </w:rPr>
@@ -1380,7 +1377,7 @@
             <w:noProof/>
             <w:webHidden/>
           </w:rPr>
-          <w:t>4</w:t>
+          <w:t>5</w:t>
         </w:r>
         <w:r>
           <w:rPr>
@@ -1393,7 +1390,7 @@
     </w:p>
     <w:p>
       <w:pPr>
-        <w:pStyle w:val="TOC3"/>
+        <w:pStyle w:val="TM3"/>
         <w:tabs>
           <w:tab w:val="left" w:pos="1440"/>
           <w:tab w:val="right" w:leader="dot" w:pos="9350"/>
@@ -1409,7 +1406,7 @@
       <w:hyperlink w:anchor="_Toc174639050" w:history="1">
         <w:r>
           <w:rPr>
-            <w:rStyle w:val="Hyperlink"/>
+            <w:rStyle w:val="Lienhypertexte"/>
             <w:rFonts w:eastAsiaTheme="majorEastAsia"/>
             <w:noProof/>
           </w:rPr>
@@ -1427,7 +1424,7 @@
         </w:r>
         <w:r>
           <w:rPr>
-            <w:rStyle w:val="Hyperlink"/>
+            <w:rStyle w:val="Lienhypertexte"/>
             <w:rFonts w:eastAsiaTheme="majorEastAsia"/>
             <w:noProof/>
           </w:rPr>
@@ -1472,7 +1469,7 @@
             <w:noProof/>
             <w:webHidden/>
           </w:rPr>
-          <w:t>4</w:t>
+          <w:t>5</w:t>
         </w:r>
         <w:r>
           <w:rPr>
@@ -1485,7 +1482,7 @@
     </w:p>
     <w:p>
       <w:pPr>
-        <w:pStyle w:val="TOC3"/>
+        <w:pStyle w:val="TM3"/>
         <w:tabs>
           <w:tab w:val="left" w:pos="1440"/>
           <w:tab w:val="right" w:leader="dot" w:pos="9350"/>
@@ -1501,7 +1498,7 @@
       <w:hyperlink w:anchor="_Toc174639051" w:history="1">
         <w:r>
           <w:rPr>
-            <w:rStyle w:val="Hyperlink"/>
+            <w:rStyle w:val="Lienhypertexte"/>
             <w:rFonts w:eastAsiaTheme="majorEastAsia"/>
             <w:noProof/>
           </w:rPr>
@@ -1519,7 +1516,7 @@
         </w:r>
         <w:r>
           <w:rPr>
-            <w:rStyle w:val="Hyperlink"/>
+            <w:rStyle w:val="Lienhypertexte"/>
             <w:rFonts w:eastAsiaTheme="majorEastAsia"/>
             <w:noProof/>
           </w:rPr>
@@ -1564,7 +1561,7 @@
             <w:noProof/>
             <w:webHidden/>
           </w:rPr>
-          <w:t>4</w:t>
+          <w:t>5</w:t>
         </w:r>
         <w:r>
           <w:rPr>
@@ -1577,7 +1574,7 @@
     </w:p>
     <w:p>
       <w:pPr>
-        <w:pStyle w:val="TOC2"/>
+        <w:pStyle w:val="TM2"/>
         <w:tabs>
           <w:tab w:val="left" w:pos="960"/>
           <w:tab w:val="right" w:leader="dot" w:pos="9350"/>
@@ -1593,7 +1590,7 @@
       <w:hyperlink w:anchor="_Toc174639052" w:history="1">
         <w:r>
           <w:rPr>
-            <w:rStyle w:val="Hyperlink"/>
+            <w:rStyle w:val="Lienhypertexte"/>
             <w:rFonts w:eastAsiaTheme="majorEastAsia"/>
             <w:noProof/>
           </w:rPr>
@@ -1611,7 +1608,7 @@
         </w:r>
         <w:r>
           <w:rPr>
-            <w:rStyle w:val="Hyperlink"/>
+            <w:rStyle w:val="Lienhypertexte"/>
             <w:rFonts w:eastAsiaTheme="majorEastAsia"/>
             <w:noProof/>
           </w:rPr>
@@ -1656,7 +1653,7 @@
             <w:noProof/>
             <w:webHidden/>
           </w:rPr>
-          <w:t>5</w:t>
+          <w:t>7</w:t>
         </w:r>
         <w:r>
           <w:rPr>
@@ -1669,7 +1666,7 @@
     </w:p>
     <w:p>
       <w:pPr>
-        <w:pStyle w:val="TOC3"/>
+        <w:pStyle w:val="TM3"/>
         <w:tabs>
           <w:tab w:val="left" w:pos="1440"/>
           <w:tab w:val="right" w:leader="dot" w:pos="9350"/>
@@ -1685,7 +1682,7 @@
       <w:hyperlink w:anchor="_Toc174639053" w:history="1">
         <w:r>
           <w:rPr>
-            <w:rStyle w:val="Hyperlink"/>
+            <w:rStyle w:val="Lienhypertexte"/>
             <w:rFonts w:eastAsiaTheme="majorEastAsia"/>
             <w:noProof/>
           </w:rPr>
@@ -1703,7 +1700,7 @@
         </w:r>
         <w:r>
           <w:rPr>
-            <w:rStyle w:val="Hyperlink"/>
+            <w:rStyle w:val="Lienhypertexte"/>
             <w:rFonts w:eastAsiaTheme="majorEastAsia"/>
             <w:noProof/>
           </w:rPr>
@@ -1748,7 +1745,7 @@
             <w:noProof/>
             <w:webHidden/>
           </w:rPr>
-          <w:t>5</w:t>
+          <w:t>7</w:t>
         </w:r>
         <w:r>
           <w:rPr>
@@ -1761,7 +1758,7 @@
     </w:p>
     <w:p>
       <w:pPr>
-        <w:pStyle w:val="TOC3"/>
+        <w:pStyle w:val="TM3"/>
         <w:tabs>
           <w:tab w:val="left" w:pos="1440"/>
           <w:tab w:val="right" w:leader="dot" w:pos="9350"/>
@@ -1777,7 +1774,7 @@
       <w:hyperlink w:anchor="_Toc174639054" w:history="1">
         <w:r>
           <w:rPr>
-            <w:rStyle w:val="Hyperlink"/>
+            <w:rStyle w:val="Lienhypertexte"/>
             <w:rFonts w:eastAsiaTheme="majorEastAsia"/>
             <w:noProof/>
           </w:rPr>
@@ -1795,7 +1792,7 @@
         </w:r>
         <w:r>
           <w:rPr>
-            <w:rStyle w:val="Hyperlink"/>
+            <w:rStyle w:val="Lienhypertexte"/>
             <w:rFonts w:eastAsiaTheme="majorEastAsia"/>
             <w:noProof/>
           </w:rPr>
@@ -1840,7 +1837,7 @@
             <w:noProof/>
             <w:webHidden/>
           </w:rPr>
-          <w:t>5</w:t>
+          <w:t>8</w:t>
         </w:r>
         <w:r>
           <w:rPr>
@@ -1853,7 +1850,7 @@
     </w:p>
     <w:p>
       <w:pPr>
-        <w:pStyle w:val="TOC2"/>
+        <w:pStyle w:val="TM2"/>
         <w:tabs>
           <w:tab w:val="left" w:pos="960"/>
           <w:tab w:val="right" w:leader="dot" w:pos="9350"/>
@@ -1869,7 +1866,7 @@
       <w:hyperlink w:anchor="_Toc174639055" w:history="1">
         <w:r>
           <w:rPr>
-            <w:rStyle w:val="Hyperlink"/>
+            <w:rStyle w:val="Lienhypertexte"/>
             <w:rFonts w:eastAsiaTheme="majorEastAsia"/>
             <w:noProof/>
           </w:rPr>
@@ -1887,7 +1884,7 @@
         </w:r>
         <w:r>
           <w:rPr>
-            <w:rStyle w:val="Hyperlink"/>
+            <w:rStyle w:val="Lienhypertexte"/>
             <w:rFonts w:eastAsiaTheme="majorEastAsia"/>
             <w:noProof/>
           </w:rPr>
@@ -1932,7 +1929,7 @@
             <w:noProof/>
             <w:webHidden/>
           </w:rPr>
-          <w:t>6</w:t>
+          <w:t>9</w:t>
         </w:r>
         <w:r>
           <w:rPr>
@@ -1945,7 +1942,7 @@
     </w:p>
     <w:p>
       <w:pPr>
-        <w:pStyle w:val="TOC3"/>
+        <w:pStyle w:val="TM3"/>
         <w:tabs>
           <w:tab w:val="left" w:pos="1440"/>
           <w:tab w:val="right" w:leader="dot" w:pos="9350"/>
@@ -1961,7 +1958,7 @@
       <w:hyperlink w:anchor="_Toc174639056" w:history="1">
         <w:r>
           <w:rPr>
-            <w:rStyle w:val="Hyperlink"/>
+            <w:rStyle w:val="Lienhypertexte"/>
             <w:rFonts w:eastAsiaTheme="majorEastAsia"/>
             <w:noProof/>
           </w:rPr>
@@ -1979,7 +1976,7 @@
         </w:r>
         <w:r>
           <w:rPr>
-            <w:rStyle w:val="Hyperlink"/>
+            <w:rStyle w:val="Lienhypertexte"/>
             <w:rFonts w:eastAsiaTheme="majorEastAsia"/>
             <w:noProof/>
           </w:rPr>
@@ -2024,7 +2021,7 @@
             <w:noProof/>
             <w:webHidden/>
           </w:rPr>
-          <w:t>6</w:t>
+          <w:t>9</w:t>
         </w:r>
         <w:r>
           <w:rPr>
@@ -2037,7 +2034,7 @@
     </w:p>
     <w:p>
       <w:pPr>
-        <w:pStyle w:val="TOC3"/>
+        <w:pStyle w:val="TM3"/>
         <w:tabs>
           <w:tab w:val="left" w:pos="1440"/>
           <w:tab w:val="right" w:leader="dot" w:pos="9350"/>
@@ -2053,7 +2050,7 @@
       <w:hyperlink w:anchor="_Toc174639057" w:history="1">
         <w:r>
           <w:rPr>
-            <w:rStyle w:val="Hyperlink"/>
+            <w:rStyle w:val="Lienhypertexte"/>
             <w:rFonts w:eastAsiaTheme="majorEastAsia"/>
             <w:noProof/>
           </w:rPr>
@@ -2071,7 +2068,7 @@
         </w:r>
         <w:r>
           <w:rPr>
-            <w:rStyle w:val="Hyperlink"/>
+            <w:rStyle w:val="Lienhypertexte"/>
             <w:rFonts w:eastAsiaTheme="majorEastAsia"/>
             <w:noProof/>
           </w:rPr>
@@ -2116,7 +2113,7 @@
             <w:noProof/>
             <w:webHidden/>
           </w:rPr>
-          <w:t>6</w:t>
+          <w:t>9</w:t>
         </w:r>
         <w:r>
           <w:rPr>
@@ -2129,7 +2126,7 @@
     </w:p>
     <w:p>
       <w:pPr>
-        <w:pStyle w:val="TOC1"/>
+        <w:pStyle w:val="TM1"/>
         <w:tabs>
           <w:tab w:val="left" w:pos="480"/>
           <w:tab w:val="right" w:leader="dot" w:pos="9350"/>
@@ -2145,7 +2142,7 @@
       <w:hyperlink w:anchor="_Toc174639058" w:history="1">
         <w:r>
           <w:rPr>
-            <w:rStyle w:val="Hyperlink"/>
+            <w:rStyle w:val="Lienhypertexte"/>
             <w:rFonts w:eastAsiaTheme="majorEastAsia"/>
             <w:noProof/>
           </w:rPr>
@@ -2163,7 +2160,7 @@
         </w:r>
         <w:r>
           <w:rPr>
-            <w:rStyle w:val="Hyperlink"/>
+            <w:rStyle w:val="Lienhypertexte"/>
             <w:rFonts w:eastAsiaTheme="majorEastAsia"/>
             <w:noProof/>
           </w:rPr>
@@ -2208,7 +2205,7 @@
             <w:noProof/>
             <w:webHidden/>
           </w:rPr>
-          <w:t>7</w:t>
+          <w:t>10</w:t>
         </w:r>
         <w:r>
           <w:rPr>
@@ -2221,7 +2218,7 @@
     </w:p>
     <w:p>
       <w:pPr>
-        <w:pStyle w:val="TOC1"/>
+        <w:pStyle w:val="TM1"/>
         <w:tabs>
           <w:tab w:val="left" w:pos="480"/>
           <w:tab w:val="right" w:leader="dot" w:pos="9350"/>
@@ -2237,7 +2234,7 @@
       <w:hyperlink w:anchor="_Toc174639059" w:history="1">
         <w:r>
           <w:rPr>
-            <w:rStyle w:val="Hyperlink"/>
+            <w:rStyle w:val="Lienhypertexte"/>
             <w:rFonts w:eastAsiaTheme="majorEastAsia"/>
             <w:noProof/>
           </w:rPr>
@@ -2255,7 +2252,7 @@
         </w:r>
         <w:r>
           <w:rPr>
-            <w:rStyle w:val="Hyperlink"/>
+            <w:rStyle w:val="Lienhypertexte"/>
             <w:rFonts w:eastAsiaTheme="majorEastAsia"/>
             <w:noProof/>
           </w:rPr>
@@ -2300,7 +2297,7 @@
             <w:noProof/>
             <w:webHidden/>
           </w:rPr>
-          <w:t>8</w:t>
+          <w:t>11</w:t>
         </w:r>
         <w:r>
           <w:rPr>
@@ -2322,7 +2319,7 @@
     <w:p/>
     <w:p>
       <w:pPr>
-        <w:pStyle w:val="Heading1"/>
+        <w:pStyle w:val="Titre1"/>
       </w:pPr>
       <w:bookmarkStart w:id="0" w:name="_Toc174639041"/>
       <w:r>
@@ -2332,7 +2329,7 @@
     </w:p>
     <w:p>
       <w:pPr>
-        <w:pStyle w:val="Heading2"/>
+        <w:pStyle w:val="Titre2"/>
       </w:pPr>
       <w:bookmarkStart w:id="1" w:name="_Toc174639042"/>
       <w:r>
@@ -2381,7 +2378,13 @@
         <w:t>ordinateur</w:t>
       </w:r>
       <w:r>
-        <w:t xml:space="preserve"> a distance.</w:t>
+        <w:t xml:space="preserve"> </w:t>
+      </w:r>
+      <w:r>
+        <w:t>à</w:t>
+      </w:r>
+      <w:r>
+        <w:t xml:space="preserve"> distance.</w:t>
       </w:r>
     </w:p>
     <w:p/>
@@ -2426,7 +2429,7 @@
     <w:p/>
     <w:p>
       <w:pPr>
-        <w:pStyle w:val="Heading2"/>
+        <w:pStyle w:val="Titre2"/>
       </w:pPr>
       <w:bookmarkStart w:id="2" w:name="_Toc174639043"/>
       <w:r>
@@ -2436,7 +2439,7 @@
     </w:p>
     <w:p>
       <w:pPr>
-        <w:pStyle w:val="Heading3"/>
+        <w:pStyle w:val="Titre3"/>
       </w:pPr>
       <w:bookmarkStart w:id="3" w:name="_Toc174639044"/>
       <w:r>
@@ -2449,15 +2452,72 @@
     </w:p>
     <w:p>
       <w:r>
-        <w:rPr>
-          <w:highlight w:val="yellow"/>
-        </w:rPr>
-        <w:t>[Qu’est-ce que le groupe technique exige? Quelles sont les limitations technologies?]</w:t>
-      </w:r>
-    </w:p>
-    <w:p>
-      <w:pPr>
-        <w:pStyle w:val="Heading3"/>
+        <w:t>Le groupe technique requière, entre autres :</w:t>
+      </w:r>
+    </w:p>
+    <w:p>
+      <w:pPr>
+        <w:pStyle w:val="Paragraphedeliste"/>
+        <w:numPr>
+          <w:ilvl w:val="0"/>
+          <w:numId w:val="5"/>
+        </w:numPr>
+      </w:pPr>
+      <w:r>
+        <w:t>L’utilisation d’un des microcontrôleurs dans sa liste</w:t>
+      </w:r>
+    </w:p>
+    <w:p>
+      <w:pPr>
+        <w:pStyle w:val="Paragraphedeliste"/>
+        <w:numPr>
+          <w:ilvl w:val="0"/>
+          <w:numId w:val="5"/>
+        </w:numPr>
+      </w:pPr>
+      <w:r>
+        <w:t>Conception d’une souris reconnu par HID</w:t>
+      </w:r>
+    </w:p>
+    <w:p>
+      <w:pPr>
+        <w:pStyle w:val="Paragraphedeliste"/>
+        <w:numPr>
+          <w:ilvl w:val="0"/>
+          <w:numId w:val="5"/>
+        </w:numPr>
+      </w:pPr>
+      <w:r>
+        <w:t>Un budget de 60$</w:t>
+      </w:r>
+    </w:p>
+    <w:p>
+      <w:pPr>
+        <w:pStyle w:val="Paragraphedeliste"/>
+        <w:numPr>
+          <w:ilvl w:val="0"/>
+          <w:numId w:val="5"/>
+        </w:numPr>
+      </w:pPr>
+      <w:r>
+        <w:t>Une date limite</w:t>
+      </w:r>
+    </w:p>
+    <w:p>
+      <w:pPr>
+        <w:pStyle w:val="Paragraphedeliste"/>
+        <w:numPr>
+          <w:ilvl w:val="0"/>
+          <w:numId w:val="5"/>
+        </w:numPr>
+      </w:pPr>
+      <w:r>
+        <w:t>Le thème « Hacker »</w:t>
+      </w:r>
+    </w:p>
+    <w:p>
+      <w:pPr>
+        <w:pStyle w:val="Titre3"/>
       </w:pPr>
       <w:bookmarkStart w:id="4" w:name="_Toc174639045"/>
       <w:r>
@@ -2477,7 +2537,7 @@
     </w:p>
     <w:p>
       <w:pPr>
-        <w:pStyle w:val="Heading2"/>
+        <w:pStyle w:val="Titre2"/>
       </w:pPr>
       <w:bookmarkStart w:id="5" w:name="_Toc174639046"/>
       <w:r>
@@ -2492,7 +2552,7 @@
     </w:p>
     <w:p>
       <w:pPr>
-        <w:pStyle w:val="ListParagraph"/>
+        <w:pStyle w:val="Paragraphedeliste"/>
         <w:numPr>
           <w:ilvl w:val="0"/>
           <w:numId w:val="4"/>
@@ -2504,7 +2564,7 @@
     </w:p>
     <w:p>
       <w:pPr>
-        <w:pStyle w:val="ListParagraph"/>
+        <w:pStyle w:val="Paragraphedeliste"/>
         <w:numPr>
           <w:ilvl w:val="0"/>
           <w:numId w:val="4"/>
@@ -2516,7 +2576,7 @@
     </w:p>
     <w:p>
       <w:pPr>
-        <w:pStyle w:val="ListParagraph"/>
+        <w:pStyle w:val="Paragraphedeliste"/>
         <w:numPr>
           <w:ilvl w:val="0"/>
           <w:numId w:val="4"/>
@@ -2528,7 +2588,7 @@
     </w:p>
     <w:p>
       <w:pPr>
-        <w:pStyle w:val="ListParagraph"/>
+        <w:pStyle w:val="Paragraphedeliste"/>
         <w:numPr>
           <w:ilvl w:val="0"/>
           <w:numId w:val="4"/>
@@ -2540,7 +2600,7 @@
     </w:p>
     <w:p>
       <w:pPr>
-        <w:pStyle w:val="ListParagraph"/>
+        <w:pStyle w:val="Paragraphedeliste"/>
         <w:numPr>
           <w:ilvl w:val="0"/>
           <w:numId w:val="4"/>
@@ -2552,7 +2612,7 @@
     </w:p>
     <w:p>
       <w:pPr>
-        <w:pStyle w:val="ListParagraph"/>
+        <w:pStyle w:val="Paragraphedeliste"/>
         <w:numPr>
           <w:ilvl w:val="0"/>
           <w:numId w:val="4"/>
@@ -2564,7 +2624,7 @@
     </w:p>
     <w:p>
       <w:pPr>
-        <w:pStyle w:val="Heading3"/>
+        <w:pStyle w:val="Titre3"/>
       </w:pPr>
       <w:bookmarkStart w:id="6" w:name="_Toc174639047"/>
       <w:r>
@@ -2574,60 +2634,152 @@
     </w:p>
     <w:p>
       <w:r>
+        <w:t xml:space="preserve">La </w:t>
+      </w:r>
+      <w:r>
+        <w:fldChar w:fldCharType="begin"/>
+      </w:r>
+      <w:r>
+        <w:instrText xml:space="preserve"> REF _Ref174884844 \h </w:instrText>
+      </w:r>
+      <w:r>
+        <w:fldChar w:fldCharType="separate"/>
+      </w:r>
+      <w:r>
+        <w:t xml:space="preserve">Figure </w:t>
+      </w:r>
+      <w:r>
         <w:rPr>
-          <w:highlight w:val="yellow"/>
+          <w:noProof/>
         </w:rPr>
-        <w:t xml:space="preserve">[Schéma bloc qui relie les différentes parties du projet. </w:t>
+        <w:t>1</w:t>
+      </w:r>
+      <w:r>
+        <w:fldChar w:fldCharType="end"/>
+      </w:r>
+      <w:r>
+        <w:t xml:space="preserve"> présente le schéma bloc global de la souris.</w:t>
+      </w:r>
+    </w:p>
+    <w:p>
+      <w:pPr>
+        <w:keepNext/>
+      </w:pPr>
+      <w:r>
+        <w:lastRenderedPageBreak/>
+        <w:drawing>
+          <wp:inline distT="0" distB="0" distL="0" distR="0" wp14:anchorId="7D1DF9AE" wp14:editId="1D4EFCD8">
+            <wp:extent cx="5894198" cy="5070475"/>
+            <wp:effectExtent l="0" t="0" r="0" b="0"/>
+            <wp:docPr id="2076343614" name="Image 1"/>
+            <wp:cNvGraphicFramePr>
+              <a:graphicFrameLocks xmlns:a="http://schemas.openxmlformats.org/drawingml/2006/main" noChangeAspect="1"/>
+            </wp:cNvGraphicFramePr>
+            <a:graphic xmlns:a="http://schemas.openxmlformats.org/drawingml/2006/main">
+              <a:graphicData uri="http://schemas.openxmlformats.org/drawingml/2006/picture">
+                <pic:pic xmlns:pic="http://schemas.openxmlformats.org/drawingml/2006/picture">
+                  <pic:nvPicPr>
+                    <pic:cNvPr id="2076343614" name="Image 1"/>
+                    <pic:cNvPicPr/>
+                  </pic:nvPicPr>
+                  <pic:blipFill>
+                    <a:blip r:embed="rId9">
+                      <a:extLst>
+                        <a:ext uri="{28A0092B-C50C-407E-A947-70E740481C1C}">
+                          <a14:useLocalDpi xmlns:a14="http://schemas.microsoft.com/office/drawing/2010/main" val="0"/>
+                        </a:ext>
+                      </a:extLst>
+                    </a:blip>
+                    <a:stretch>
+                      <a:fillRect/>
+                    </a:stretch>
+                  </pic:blipFill>
+                  <pic:spPr>
+                    <a:xfrm>
+                      <a:off x="0" y="0"/>
+                      <a:ext cx="5894198" cy="5070475"/>
+                    </a:xfrm>
+                    <a:prstGeom prst="rect">
+                      <a:avLst/>
+                    </a:prstGeom>
+                  </pic:spPr>
+                </pic:pic>
+              </a:graphicData>
+            </a:graphic>
+          </wp:inline>
+        </w:drawing>
+      </w:r>
+    </w:p>
+    <w:p>
+      <w:pPr>
+        <w:pStyle w:val="Lgende"/>
+        <w:jc w:val="center"/>
+      </w:pPr>
+      <w:bookmarkStart w:id="7" w:name="_Ref174884844"/>
+      <w:r>
+        <w:t xml:space="preserve">Figure </w:t>
+      </w:r>
+      <w:r>
+        <w:fldChar w:fldCharType="begin"/>
+      </w:r>
+      <w:r>
+        <w:instrText xml:space="preserve"> SEQ Figure \* ARABIC </w:instrText>
+      </w:r>
+      <w:r>
+        <w:fldChar w:fldCharType="separate"/>
       </w:r>
       <w:r>
         <w:rPr>
-          <w:highlight w:val="yellow"/>
+          <w:noProof/>
         </w:rPr>
-        <w:t>Flèches indiquant la transmission de données. Aucun numéro de pièce (ex. un STM32 est le microcontrôleur)</w:t>
-      </w:r>
-      <w:r>
-        <w:rPr>
-          <w:highlight w:val="yellow"/>
-        </w:rPr>
-        <w:t>]</w:t>
-      </w:r>
+        <w:t>1</w:t>
+      </w:r>
+      <w:r>
+        <w:fldChar w:fldCharType="end"/>
+      </w:r>
+      <w:bookmarkEnd w:id="7"/>
+      <w:r>
+        <w:t xml:space="preserve"> : Schéma bloc global</w:t>
+      </w:r>
+    </w:p>
+    <w:p>
       <w:r>
         <w:br w:type="page"/>
       </w:r>
     </w:p>
     <w:p>
       <w:pPr>
-        <w:pStyle w:val="Heading1"/>
+        <w:pStyle w:val="Titre1"/>
         <w:spacing w:line="276" w:lineRule="auto"/>
       </w:pPr>
-      <w:bookmarkStart w:id="7" w:name="_Toc174639048"/>
+      <w:bookmarkStart w:id="8" w:name="_Toc174639048"/>
       <w:r>
         <w:lastRenderedPageBreak/>
         <w:t>Développement</w:t>
       </w:r>
-      <w:bookmarkEnd w:id="7"/>
-    </w:p>
-    <w:p>
-      <w:pPr>
-        <w:pStyle w:val="Heading2"/>
+      <w:bookmarkEnd w:id="8"/>
+    </w:p>
+    <w:p>
+      <w:pPr>
+        <w:pStyle w:val="Titre2"/>
         <w:spacing w:before="0" w:line="276" w:lineRule="auto"/>
       </w:pPr>
-      <w:bookmarkStart w:id="8" w:name="_Toc174639049"/>
+      <w:bookmarkStart w:id="9" w:name="_Toc174639049"/>
       <w:r>
         <w:t>Conception électronique</w:t>
       </w:r>
-      <w:bookmarkEnd w:id="8"/>
-    </w:p>
-    <w:p>
-      <w:pPr>
-        <w:pStyle w:val="Heading3"/>
+      <w:bookmarkEnd w:id="9"/>
+    </w:p>
+    <w:p>
+      <w:pPr>
+        <w:pStyle w:val="Titre3"/>
         <w:spacing w:line="276" w:lineRule="auto"/>
       </w:pPr>
-      <w:bookmarkStart w:id="9" w:name="_Toc174639050"/>
+      <w:bookmarkStart w:id="10" w:name="_Toc174639050"/>
       <w:r>
         <w:t>Choix technologiques</w:t>
       </w:r>
-      <w:bookmarkEnd w:id="9"/>
+      <w:bookmarkEnd w:id="10"/>
     </w:p>
     <w:p>
       <w:r>
@@ -2645,7 +2797,13 @@
         <w:t xml:space="preserve"> sans </w:t>
       </w:r>
       <w:r>
-        <w:t>crystal</w:t>
+        <w:t>cr</w:t>
+      </w:r>
+      <w:r>
+        <w:t>i</w:t>
+      </w:r>
+      <w:r>
+        <w:t>stal</w:t>
       </w:r>
       <w:r>
         <w:t xml:space="preserve"> ou flash à l’intérieur à des fins d’apprentissages.</w:t>
@@ -2676,27 +2834,33 @@
     </w:p>
     <w:p>
       <w:r>
-        <w:t>Pour le contrôle de la souris, les capteurs optique étant cher et notre budget étant limité, il fallait trouver une alternative efficace pour un présentateur, soit un joystick 2 axis qui facilite le contrôle mobile de la souris.</w:t>
-      </w:r>
-    </w:p>
-    <w:p>
-      <w:pPr>
-        <w:pStyle w:val="Heading4"/>
-      </w:pPr>
-    </w:p>
-    <w:p>
-      <w:pPr>
-        <w:pStyle w:val="Heading3"/>
+        <w:t xml:space="preserve">Pour le contrôle de la souris, </w:t>
+      </w:r>
+      <w:r>
+        <w:t>les capteurs optiques</w:t>
+      </w:r>
+      <w:r>
+        <w:t xml:space="preserve"> étant cher et notre budget étant limité, il fallait trouver une alternative efficace pour un présentateur, soit un joystick 2 axis qui facilite le contrôle mobile de la souris.</w:t>
+      </w:r>
+    </w:p>
+    <w:p>
+      <w:pPr>
+        <w:pStyle w:val="Titre4"/>
+      </w:pPr>
+    </w:p>
+    <w:p>
+      <w:pPr>
+        <w:pStyle w:val="Titre3"/>
         <w:spacing w:line="276" w:lineRule="auto"/>
       </w:pPr>
-      <w:bookmarkStart w:id="10" w:name="_Toc174639051"/>
+      <w:bookmarkStart w:id="11" w:name="_Toc174639051"/>
       <w:r>
         <w:t>Schémas électriques</w:t>
       </w:r>
       <w:r>
         <w:t xml:space="preserve"> et conception PCB</w:t>
       </w:r>
-      <w:bookmarkEnd w:id="10"/>
+      <w:bookmarkEnd w:id="11"/>
     </w:p>
     <w:p>
       <w:pPr>
@@ -2704,35 +2868,36 @@
         <w:jc w:val="left"/>
       </w:pPr>
       <w:r>
-        <w:t xml:space="preserve">[Présentation du schéma électrique </w:t>
-      </w:r>
-      <w:r>
-        <w:t>complet</w:t>
-      </w:r>
-      <w:r>
-        <w:t xml:space="preserve"> et du PCB (dessus et dessous, une couche visible à la fois)</w:t>
-      </w:r>
-      <w:r>
-        <w:t>. Explication générale du fonctionnement</w:t>
-      </w:r>
-      <w:r>
-        <w:t xml:space="preserve"> électrique de la solution</w:t>
-      </w:r>
-      <w:r>
-        <w:t xml:space="preserve">. </w:t>
-      </w:r>
-      <w:r>
-        <w:t xml:space="preserve">Le choix de placement de composants est utile ici </w:t>
-      </w:r>
-      <w:r>
-        <w:t>si vous voulez justifier un choix particulier</w:t>
-      </w:r>
-      <w:r>
-        <w:t>]</w:t>
-      </w:r>
-    </w:p>
-    <w:p>
-      <w:pPr>
+        <w:t xml:space="preserve">La </w:t>
+      </w:r>
+      <w:r>
+        <w:fldChar w:fldCharType="begin"/>
+      </w:r>
+      <w:r>
+        <w:instrText xml:space="preserve"> REF _Ref174883183 \h </w:instrText>
+      </w:r>
+      <w:r>
+        <w:fldChar w:fldCharType="separate"/>
+      </w:r>
+      <w:r>
+        <w:t xml:space="preserve">Figure </w:t>
+      </w:r>
+      <w:r>
+        <w:rPr>
+          <w:noProof/>
+        </w:rPr>
+        <w:t>2</w:t>
+      </w:r>
+      <w:r>
+        <w:fldChar w:fldCharType="end"/>
+      </w:r>
+      <w:r>
+        <w:t xml:space="preserve"> présente le schéma électrique de la souris.</w:t>
+      </w:r>
+    </w:p>
+    <w:p>
+      <w:pPr>
+        <w:keepNext/>
         <w:spacing w:after="160" w:line="259" w:lineRule="auto"/>
         <w:jc w:val="left"/>
       </w:pPr>
@@ -2756,7 +2921,7 @@
                     <pic:cNvPicPr/>
                   </pic:nvPicPr>
                   <pic:blipFill>
-                    <a:blip r:embed="rId9"/>
+                    <a:blip r:embed="rId10"/>
                     <a:stretch>
                       <a:fillRect/>
                     </a:stretch>
@@ -2779,6 +2944,38 @@
     </w:p>
     <w:p>
       <w:pPr>
+        <w:pStyle w:val="Lgende"/>
+        <w:jc w:val="center"/>
+      </w:pPr>
+      <w:bookmarkStart w:id="12" w:name="_Ref174883183"/>
+      <w:r>
+        <w:t xml:space="preserve">Figure </w:t>
+      </w:r>
+      <w:r>
+        <w:fldChar w:fldCharType="begin"/>
+      </w:r>
+      <w:r>
+        <w:instrText xml:space="preserve"> SEQ Figure \* ARABIC </w:instrText>
+      </w:r>
+      <w:r>
+        <w:fldChar w:fldCharType="separate"/>
+      </w:r>
+      <w:r>
+        <w:rPr>
+          <w:noProof/>
+        </w:rPr>
+        <w:t>2</w:t>
+      </w:r>
+      <w:r>
+        <w:fldChar w:fldCharType="end"/>
+      </w:r>
+      <w:bookmarkEnd w:id="12"/>
+      <w:r>
+        <w:t xml:space="preserve"> : Schéma électrique du produit</w:t>
+      </w:r>
+    </w:p>
+    <w:p>
+      <w:pPr>
         <w:spacing w:after="160" w:line="259" w:lineRule="auto"/>
         <w:jc w:val="left"/>
       </w:pPr>
@@ -2793,13 +2990,31 @@
       </w:pPr>
       <w:r>
         <w:lastRenderedPageBreak/>
-        <w:t xml:space="preserve">Pour le fonctionnement du micro-controlleur, il fallait un crystal, </w:t>
+        <w:t xml:space="preserve">Pour le fonctionnement du </w:t>
+      </w:r>
+      <w:r>
+        <w:t>microcontrôleur</w:t>
+      </w:r>
+      <w:r>
+        <w:t>, il fallait un cr</w:t>
+      </w:r>
+      <w:r>
+        <w:t>i</w:t>
+      </w:r>
+      <w:r>
+        <w:t xml:space="preserve">stal, </w:t>
       </w:r>
       <w:r>
         <w:t>un flash</w:t>
       </w:r>
       <w:r>
-        <w:t>, un connecteur (micro USB dans le cas du produit) ainsi qu’un régulateur pour avoir un 3V3. Les autres modules étaient pour les fonctionnalités de la souris et non pour le fonctionnement du micro-controleur. Des capacités de découplages ont été aussi utilisé pour réduire le bruit et les fluctuations.</w:t>
+        <w:t xml:space="preserve">, un connecteur (micro USB dans le cas du produit) ainsi qu’un régulateur pour avoir un 3V3. Les autres modules étaient pour les fonctionnalités de la souris et non pour le fonctionnement du </w:t>
+      </w:r>
+      <w:r>
+        <w:t>microcontrôleur</w:t>
+      </w:r>
+      <w:r>
+        <w:t>. Des capacités de découplages ont été aussi utilisé pour réduire le bruit et les fluctuations.</w:t>
       </w:r>
     </w:p>
     <w:p>
@@ -2808,15 +3023,70 @@
         <w:jc w:val="left"/>
       </w:pPr>
       <w:r>
-        <w:t xml:space="preserve">Cependant, les composantes liés au ESP32, comme le crystal et le flash devait être physiquement </w:t>
-      </w:r>
-      <w:r>
-        <w:t>proche du micro-controlleur pour assurer son bon fonctionnement et réduire la possibilité de problèmes liés aux traces / bruits.</w:t>
+        <w:t xml:space="preserve">Cependant, </w:t>
+      </w:r>
+      <w:r>
+        <w:t>les composantes liées</w:t>
+      </w:r>
+      <w:r>
+        <w:t xml:space="preserve"> au ESP32, comme le cr</w:t>
+      </w:r>
+      <w:r>
+        <w:t>i</w:t>
+      </w:r>
+      <w:r>
+        <w:t xml:space="preserve">stal et le flash devait être physiquement </w:t>
+      </w:r>
+      <w:r>
+        <w:t xml:space="preserve">proche du </w:t>
+      </w:r>
+      <w:r>
+        <w:t>microcontrôleur</w:t>
+      </w:r>
+      <w:r>
+        <w:t xml:space="preserve"> pour assurer son bon fonctionnement et réduire la possibilité de problèmes liés aux traces / bruits.</w:t>
+      </w:r>
+    </w:p>
+    <w:p>
+      <w:pPr>
+        <w:spacing w:after="160" w:line="259" w:lineRule="auto"/>
+        <w:jc w:val="left"/>
+      </w:pPr>
+      <w:r>
+        <w:t xml:space="preserve">La </w:t>
+      </w:r>
+      <w:r>
+        <w:fldChar w:fldCharType="begin"/>
+      </w:r>
+      <w:r>
+        <w:instrText xml:space="preserve"> REF _Ref174883308 \h </w:instrText>
+      </w:r>
+      <w:r>
+        <w:fldChar w:fldCharType="separate"/>
+      </w:r>
+      <w:r>
+        <w:rPr>
+          <w:i/>
+          <w:iCs/>
+        </w:rPr>
+        <w:t xml:space="preserve">Figure </w:t>
+      </w:r>
+      <w:r>
+        <w:rPr>
+          <w:noProof/>
+        </w:rPr>
+        <w:t>3</w:t>
+      </w:r>
+      <w:r>
+        <w:fldChar w:fldCharType="end"/>
+      </w:r>
+      <w:r>
+        <w:t xml:space="preserve"> présente les 4 couches du PCB.</w:t>
       </w:r>
     </w:p>
     <w:tbl>
       <w:tblPr>
-        <w:tblStyle w:val="TableGrid"/>
+        <w:tblStyle w:val="Grilledutableau"/>
         <w:tblW w:w="0" w:type="auto"/>
         <w:tblLook w:val="04A0" w:firstRow="1" w:lastRow="0" w:firstColumn="1" w:lastColumn="0" w:noHBand="0" w:noVBand="1"/>
       </w:tblPr>
@@ -2827,10 +3097,11 @@
       <w:tr>
         <w:tc>
           <w:tcPr>
-            <w:tcW w:w="4675" w:type="dxa"/>
+            <w:tcW w:w="4654" w:type="dxa"/>
           </w:tcPr>
           <w:p>
             <w:pPr>
+              <w:keepNext/>
               <w:spacing w:after="160" w:line="259" w:lineRule="auto"/>
               <w:jc w:val="left"/>
             </w:pPr>
@@ -2854,7 +3125,7 @@
                           <pic:cNvPicPr/>
                         </pic:nvPicPr>
                         <pic:blipFill>
-                          <a:blip r:embed="rId10"/>
+                          <a:blip r:embed="rId11"/>
                           <a:stretch>
                             <a:fillRect/>
                           </a:stretch>
@@ -2878,7 +3149,7 @@
         </w:tc>
         <w:tc>
           <w:tcPr>
-            <w:tcW w:w="4675" w:type="dxa"/>
+            <w:tcW w:w="4696" w:type="dxa"/>
           </w:tcPr>
           <w:p>
             <w:pPr>
@@ -2905,7 +3176,7 @@
                           <pic:cNvPicPr/>
                         </pic:nvPicPr>
                         <pic:blipFill>
-                          <a:blip r:embed="rId11"/>
+                          <a:blip r:embed="rId12"/>
                           <a:stretch>
                             <a:fillRect/>
                           </a:stretch>
@@ -2931,6 +3202,50 @@
     </w:tbl>
     <w:p>
       <w:pPr>
+        <w:pStyle w:val="Lgende"/>
+        <w:jc w:val="center"/>
+      </w:pPr>
+      <w:bookmarkStart w:id="13" w:name="_Ref174883308"/>
+      <w:r>
+        <w:t xml:space="preserve">Figure </w:t>
+      </w:r>
+      <w:r>
+        <w:fldChar w:fldCharType="begin"/>
+      </w:r>
+      <w:r>
+        <w:instrText xml:space="preserve"> SEQ Figure \* ARABIC </w:instrText>
+      </w:r>
+      <w:r>
+        <w:fldChar w:fldCharType="separate"/>
+      </w:r>
+      <w:r>
+        <w:rPr>
+          <w:noProof/>
+        </w:rPr>
+        <w:t>3</w:t>
+      </w:r>
+      <w:r>
+        <w:fldChar w:fldCharType="end"/>
+      </w:r>
+      <w:bookmarkEnd w:id="13"/>
+      <w:r>
+        <w:t xml:space="preserve"> : </w:t>
+      </w:r>
+      <w:r>
+        <w:t xml:space="preserve">Schémas des </w:t>
+      </w:r>
+      <w:r>
+        <w:t>q</w:t>
+      </w:r>
+      <w:r>
+        <w:t>uatre</w:t>
+      </w:r>
+      <w:r>
+        <w:t xml:space="preserve"> couches du PCB</w:t>
+      </w:r>
+    </w:p>
+    <w:p>
+      <w:pPr>
         <w:spacing w:after="160" w:line="259" w:lineRule="auto"/>
         <w:jc w:val="left"/>
       </w:pPr>
@@ -2944,7 +3259,15 @@
         <w:jc w:val="left"/>
       </w:pPr>
       <w:r>
-        <w:t>L’une des couches est un ground plane</w:t>
+        <w:t xml:space="preserve">L’une des couches est un </w:t>
+      </w:r>
+      <w:proofErr w:type="spellStart"/>
+      <w:r>
+        <w:t>ground</w:t>
+      </w:r>
+      <w:proofErr w:type="spellEnd"/>
+      <w:r>
+        <w:t xml:space="preserve"> plane</w:t>
       </w:r>
       <w:r>
         <w:t xml:space="preserve"> (couche 2) pour réduire le plus de bruit possible. L</w:t>
@@ -2953,64 +3276,88 @@
         <w:t>’antenne est sur la couche du dessus</w:t>
       </w:r>
       <w:r>
-        <w:t xml:space="preserve"> et n’a rien de proche pour l’obstruer. Les traces se trouvent sur tous les couches sauf sur le ground plane.</w:t>
-      </w:r>
-      <w:r>
-        <w:rPr>
-          <w:lang w:val="en-CA"/>
-        </w:rPr>
+        <w:t xml:space="preserve"> et n’a rien de proche pour l’obstruer. Les traces se trouvent sur tous les couches sauf sur le </w:t>
+      </w:r>
+      <w:proofErr w:type="spellStart"/>
+      <w:r>
+        <w:t>ground</w:t>
+      </w:r>
+      <w:proofErr w:type="spellEnd"/>
+      <w:r>
+        <w:t xml:space="preserve"> plane.</w:t>
+      </w:r>
+      <w:r>
         <w:br w:type="page"/>
       </w:r>
     </w:p>
     <w:p>
       <w:pPr>
-        <w:pStyle w:val="Heading2"/>
-      </w:pPr>
-      <w:bookmarkStart w:id="11" w:name="_Toc174639052"/>
+        <w:pStyle w:val="Titre2"/>
+      </w:pPr>
+      <w:bookmarkStart w:id="14" w:name="_Toc174639052"/>
       <w:r>
         <w:lastRenderedPageBreak/>
         <w:t>Conception informatique</w:t>
       </w:r>
-      <w:bookmarkEnd w:id="11"/>
-    </w:p>
-    <w:p>
-      <w:pPr>
-        <w:pStyle w:val="Heading3"/>
-      </w:pPr>
-      <w:bookmarkStart w:id="12" w:name="_Toc174639053"/>
+      <w:bookmarkEnd w:id="14"/>
+    </w:p>
+    <w:p>
+      <w:pPr>
+        <w:pStyle w:val="Titre3"/>
+      </w:pPr>
+      <w:bookmarkStart w:id="15" w:name="_Toc174639053"/>
       <w:r>
         <w:t>Présentation globale du code</w:t>
       </w:r>
-      <w:bookmarkEnd w:id="12"/>
+      <w:bookmarkEnd w:id="15"/>
     </w:p>
     <w:p/>
     <w:p>
-      <w:pPr>
-        <w:rPr>
-          <w:lang w:val="en-US"/>
-        </w:rPr>
-      </w:pPr>
-      <w:r>
-        <w:t xml:space="preserve">Le code est très simple pour le projet HackerMouse. Dans le main, il a juste l’initialisation et après il attend pour hacker. Dans initialisation, un timer est partie pour avoir une base temps. Dans la base de temps, le code exécute les actions de la sourie. La base de temps me permet d’avoir un contrôle </w:t>
+      <w:r>
+        <w:t xml:space="preserve">Le code est très simple pour le projet </w:t>
+      </w:r>
+      <w:proofErr w:type="spellStart"/>
+      <w:r>
+        <w:t>HackerMouse</w:t>
+      </w:r>
+      <w:proofErr w:type="spellEnd"/>
+      <w:r>
+        <w:t xml:space="preserve">. Dans </w:t>
+      </w:r>
+      <w:proofErr w:type="gramStart"/>
+      <w:r>
+        <w:t>le main</w:t>
+      </w:r>
+      <w:proofErr w:type="gramEnd"/>
+      <w:r>
+        <w:t xml:space="preserve">, il a juste l’initialisation et après il attend pour hacker. Dans initialisation, un </w:t>
+      </w:r>
+      <w:proofErr w:type="spellStart"/>
+      <w:r>
+        <w:t>timer</w:t>
+      </w:r>
+      <w:proofErr w:type="spellEnd"/>
+      <w:r>
+        <w:t xml:space="preserve"> est partie pour avoir une base temps. Dans la base de temps, le code exécute les actions de la sourie. La base de temps me permet d’avoir un contrôle </w:t>
       </w:r>
       <w:r>
         <w:t xml:space="preserve">plus régulier. Cela va permettre un contrôle de la sourie plus </w:t>
       </w:r>
       <w:r>
-        <w:rPr>
-          <w:lang w:val="en-CA"/>
-        </w:rPr>
-        <w:t xml:space="preserve">“smooth” </w:t>
-      </w:r>
-      <w:r>
-        <w:rPr>
-          <w:lang w:val="en-US"/>
-        </w:rPr>
-        <w:t>à l’écran.</w:t>
-      </w:r>
-    </w:p>
-    <w:p>
-      <w:pPr>
+        <w:t>“</w:t>
+      </w:r>
+      <w:proofErr w:type="spellStart"/>
+      <w:r>
+        <w:t>smooth</w:t>
+      </w:r>
+      <w:proofErr w:type="spellEnd"/>
+      <w:r>
+        <w:t>” à l’écran.</w:t>
+      </w:r>
+    </w:p>
+    <w:p>
+      <w:pPr>
+        <w:keepNext/>
         <w:jc w:val="center"/>
       </w:pPr>
       <w:r>
@@ -3035,7 +3382,7 @@
                     </pic:cNvPicPr>
                   </pic:nvPicPr>
                   <pic:blipFill>
-                    <a:blip r:embed="rId12">
+                    <a:blip r:embed="rId13">
                       <a:extLst>
                         <a:ext uri="{28A0092B-C50C-407E-A947-70E740481C1C}">
                           <a14:useLocalDpi xmlns:a14="http://schemas.microsoft.com/office/drawing/2010/main" val="0"/>
@@ -3069,15 +3416,53 @@
     </w:p>
     <w:p>
       <w:pPr>
+        <w:pStyle w:val="Lgende"/>
         <w:jc w:val="center"/>
       </w:pPr>
+      <w:r>
+        <w:t xml:space="preserve">Figure </w:t>
+      </w:r>
+      <w:r>
+        <w:fldChar w:fldCharType="begin"/>
+      </w:r>
+      <w:r>
+        <w:instrText xml:space="preserve"> SEQ Figure \* ARABIC </w:instrText>
+      </w:r>
+      <w:r>
+        <w:fldChar w:fldCharType="separate"/>
+      </w:r>
+      <w:r>
+        <w:rPr>
+          <w:noProof/>
+        </w:rPr>
+        <w:t>4</w:t>
+      </w:r>
+      <w:r>
+        <w:fldChar w:fldCharType="end"/>
+      </w:r>
+      <w:r>
+        <w:t xml:space="preserve"> : Schéma bloc du code de la souris</w:t>
+      </w:r>
+    </w:p>
+    <w:p>
+      <w:pPr>
+        <w:jc w:val="center"/>
+      </w:pPr>
     </w:p>
     <w:p>
       <w:pPr>
         <w:jc w:val="left"/>
       </w:pPr>
       <w:r>
-        <w:t>Dans la base de temps, il y a seulement la fonction MouseStuff. Cette fonction fait bouger la sourie à l’écran et fait les actions des boutons de la sourie. Le mouvement de la sourie fonctionne par delta. La commande est seulement envoyée lorsque qu’un changement est fait.</w:t>
+        <w:t xml:space="preserve">Dans la base de temps, il y a seulement la fonction </w:t>
+      </w:r>
+      <w:proofErr w:type="spellStart"/>
+      <w:r>
+        <w:t>MouseStuff</w:t>
+      </w:r>
+      <w:proofErr w:type="spellEnd"/>
+      <w:r>
+        <w:t>. Cette fonction fait bouger la sourie à l’écran et fait les actions des boutons de la sourie. Le mouvement de la sourie fonctionne par delta. La commande est seulement envoyée lorsque qu’un changement est fait.</w:t>
       </w:r>
     </w:p>
     <w:p>
@@ -3091,19 +3476,27 @@
     </w:p>
     <w:p>
       <w:pPr>
-        <w:pStyle w:val="Heading3"/>
-      </w:pPr>
-      <w:bookmarkStart w:id="13" w:name="_Toc174639054"/>
+        <w:pStyle w:val="Titre3"/>
+      </w:pPr>
+      <w:bookmarkStart w:id="16" w:name="_Toc174639054"/>
       <w:r>
         <w:lastRenderedPageBreak/>
         <w:t>Librairies</w:t>
       </w:r>
-      <w:bookmarkEnd w:id="13"/>
+      <w:bookmarkEnd w:id="16"/>
     </w:p>
     <w:p/>
     <w:p>
       <w:r>
-        <w:t>Les libraries utilis</w:t>
+        <w:t xml:space="preserve">Les </w:t>
+      </w:r>
+      <w:proofErr w:type="spellStart"/>
+      <w:r>
+        <w:t>libraries</w:t>
+      </w:r>
+      <w:proofErr w:type="spellEnd"/>
+      <w:r>
+        <w:t xml:space="preserve"> utilis</w:t>
       </w:r>
       <w:r>
         <w:t>ées</w:t>
@@ -3115,7 +3508,31 @@
         <w:t xml:space="preserve"> </w:t>
       </w:r>
       <w:r>
-        <w:t>(freeRTOS). Nous avons aussi utilisé la library de tinyUSB pour la communication USB.</w:t>
+        <w:t>(</w:t>
+      </w:r>
+      <w:proofErr w:type="spellStart"/>
+      <w:r>
+        <w:t>freeRTOS</w:t>
+      </w:r>
+      <w:proofErr w:type="spellEnd"/>
+      <w:r>
+        <w:t xml:space="preserve">). Nous avons aussi utilisé la </w:t>
+      </w:r>
+      <w:proofErr w:type="spellStart"/>
+      <w:r>
+        <w:t>library</w:t>
+      </w:r>
+      <w:proofErr w:type="spellEnd"/>
+      <w:r>
+        <w:t xml:space="preserve"> de </w:t>
+      </w:r>
+      <w:proofErr w:type="spellStart"/>
+      <w:r>
+        <w:t>tinyUSB</w:t>
+      </w:r>
+      <w:proofErr w:type="spellEnd"/>
+      <w:r>
+        <w:t xml:space="preserve"> pour la communication USB.</w:t>
       </w:r>
       <w:r>
         <w:t xml:space="preserve"> Sinon, la base de temps et la gestion du esp est fait par nous.</w:t>
@@ -3132,126 +3549,87 @@
     </w:p>
     <w:p>
       <w:pPr>
-        <w:pStyle w:val="Heading2"/>
-      </w:pPr>
-      <w:bookmarkStart w:id="14" w:name="_Toc174639055"/>
+        <w:pStyle w:val="Titre2"/>
+      </w:pPr>
+      <w:bookmarkStart w:id="17" w:name="_Toc174639055"/>
       <w:r>
         <w:lastRenderedPageBreak/>
         <w:t>Gestion</w:t>
       </w:r>
-      <w:bookmarkEnd w:id="14"/>
-    </w:p>
-    <w:p>
-      <w:pPr>
-        <w:pStyle w:val="Heading3"/>
-      </w:pPr>
-      <w:bookmarkStart w:id="15" w:name="_Toc174639056"/>
+      <w:bookmarkEnd w:id="17"/>
+    </w:p>
+    <w:p>
+      <w:pPr>
+        <w:pStyle w:val="Titre3"/>
+      </w:pPr>
+      <w:bookmarkStart w:id="18" w:name="_Toc174639056"/>
       <w:r>
         <w:t>Temps</w:t>
       </w:r>
-      <w:bookmarkEnd w:id="15"/>
-    </w:p>
-    <w:p>
-      <w:r>
-        <w:t>[</w:t>
-      </w:r>
-      <w:r>
-        <w:rPr>
-          <w:highlight w:val="yellow"/>
-        </w:rPr>
-        <w:t>Quelles ont été vos échéances d’équipe? Quand avez-vous commandé les pièces, les PCBs, fait l’assemblage et le code?</w:t>
-      </w:r>
-      <w:r>
-        <w:rPr>
-          <w:highlight w:val="yellow"/>
-        </w:rPr>
-        <w:t xml:space="preserve"> Commenter. Vous ne perdrez pas de points à être honnête! C’est plus avantageux d’apprendre de ses erreurs.</w:t>
-      </w:r>
-      <w:r>
-        <w:rPr>
-          <w:highlight w:val="yellow"/>
-        </w:rPr>
-        <w:t>]</w:t>
-      </w:r>
-    </w:p>
-    <w:p>
-      <w:r>
-        <w:t>asd</w:t>
-      </w:r>
+      <w:bookmarkEnd w:id="18"/>
     </w:p>
     <w:p/>
     <w:p>
-      <w:pPr>
-        <w:pStyle w:val="Heading3"/>
-      </w:pPr>
-      <w:bookmarkStart w:id="16" w:name="_Toc174639057"/>
+      <w:r>
+        <w:t>Les échéances étaient très lousses dans l’équipe. Le but était de faire la deuxième commande de PCB afin d’avoir le temps d’assembler, débugger et coder sur le produit. Les deux vrais échéances suivis étaient la commande de PCB (deuxième) et la présentation du produit.</w:t>
+      </w:r>
+    </w:p>
+    <w:p/>
+    <w:p>
+      <w:r>
+        <w:t xml:space="preserve">La commande à bien été effectuer lors de la deuxième commande, après avoir travaillés sur le schématique et le PCB lors des jours précédant cette date. </w:t>
+      </w:r>
+    </w:p>
+    <w:p/>
+    <w:p>
+      <w:r>
+        <w:t>L’équipe avait, avant le début du travail sur le schématique, établi préalablement le concept, les pièces et l’idée général de conception du produit.</w:t>
+      </w:r>
+    </w:p>
+    <w:p/>
+    <w:p>
+      <w:r>
+        <w:t xml:space="preserve">Pour l’assemblage et le codage du produit, vu la distance entre les membres de l’équipe, il était plus difficile de travailler simultanément sur le produit. Le PCB s’est donc déplacer d’endroit a l’autre afin de permettre de terminer les fonctionnalités voulus du produit. </w:t>
+      </w:r>
+    </w:p>
+    <w:p>
+      <w:pPr>
+        <w:pStyle w:val="Titre3"/>
+      </w:pPr>
+      <w:bookmarkStart w:id="19" w:name="_Toc174639057"/>
       <w:r>
         <w:t>Budget</w:t>
       </w:r>
-      <w:bookmarkEnd w:id="16"/>
-    </w:p>
-    <w:p>
-      <w:r>
-        <w:t>[</w:t>
-      </w:r>
-      <w:r>
-        <w:rPr>
-          <w:highlight w:val="yellow"/>
-        </w:rPr>
-        <w:t xml:space="preserve">Quelle quantité de budget comptiez-vous initialement utiliser? </w:t>
-      </w:r>
-      <w:r>
-        <w:rPr>
-          <w:highlight w:val="yellow"/>
-        </w:rPr>
-        <w:tab/>
-        <w:t>Que</w:t>
-      </w:r>
-      <w:r>
-        <w:rPr>
-          <w:highlight w:val="yellow"/>
-        </w:rPr>
-        <w:t xml:space="preserve">l a été votre réel coût de développement (pièces)? Combien de commandes de PCB avez-vous </w:t>
-      </w:r>
-      <w:r>
-        <w:rPr>
-          <w:highlight w:val="yellow"/>
-        </w:rPr>
-        <w:t>effectué</w:t>
-      </w:r>
-      <w:r>
-        <w:rPr>
-          <w:highlight w:val="yellow"/>
-        </w:rPr>
-        <w:t>?</w:t>
-      </w:r>
-      <w:r>
-        <w:rPr>
-          <w:highlight w:val="yellow"/>
-        </w:rPr>
-        <w:t xml:space="preserve"> Pourquoi? Encore une fois, aucun point perdu pour l’honnêteté!</w:t>
-      </w:r>
-      <w:r>
-        <w:rPr>
-          <w:highlight w:val="yellow"/>
-        </w:rPr>
-        <w:t>]</w:t>
-      </w:r>
-    </w:p>
-    <w:p>
-      <w:r>
-        <w:t xml:space="preserve">[Les points associés </w:t>
-      </w:r>
-      <w:r>
-        <w:t>à la préparation seront validés séparément par les organisateurs.</w:t>
-      </w:r>
-      <w:r>
-        <w:t>]</w:t>
-      </w:r>
-    </w:p>
-    <w:p>
-      <w:r>
-        <w:t>asd</w:t>
+      <w:bookmarkEnd w:id="19"/>
+    </w:p>
+    <w:p/>
+    <w:p>
+      <w:r>
+        <w:t xml:space="preserve">Le budget étant de 60$, l’équipe ne voulait pas le dépasser, mais les pièces nécessaires pour le PCB (ESP32-S3R8 avec les composantes nécessaires à son fonctionnement), ainsi que le PCB 4 couches ont fait </w:t>
+      </w:r>
+      <w:r>
+        <w:t>grandement</w:t>
+      </w:r>
+      <w:r>
+        <w:t xml:space="preserve"> </w:t>
+      </w:r>
+      <w:r>
+        <w:t>monter</w:t>
+      </w:r>
+      <w:r>
+        <w:t xml:space="preserve"> le prix du PCB. Avec un total de presque 60$ pour l’ensemble du projet, soit d’environ 57$, l’équipe n’a pas dépasser le budget. Afin de rester dans ce budget, l’équipe ne pouvait pas se permettre d’avoir le « Stencil » pour l’assemblage du PCB, ce qui a rendu l’assemblage légèrement plus compliqué. </w:t>
+      </w:r>
+    </w:p>
+    <w:p/>
+    <w:p>
+      <w:r>
+        <w:t>Le total par produit étant d’environ 16.48$, tout dépendamment de la quantité de produit achetés.</w:t>
+      </w:r>
+    </w:p>
+    <w:p/>
+    <w:p>
+      <w:r>
+        <w:t>L’équipe n’a eu besoin qu’une seule commande de PCB.</w:t>
       </w:r>
     </w:p>
     <w:p>
@@ -3265,35 +3643,107 @@
     </w:p>
     <w:p>
       <w:pPr>
-        <w:pStyle w:val="Heading1"/>
-      </w:pPr>
-      <w:bookmarkStart w:id="17" w:name="_Toc174639058"/>
+        <w:pStyle w:val="Titre1"/>
+      </w:pPr>
+      <w:bookmarkStart w:id="20" w:name="_Toc174639058"/>
       <w:r>
         <w:lastRenderedPageBreak/>
         <w:t>Conclusion</w:t>
       </w:r>
-      <w:bookmarkEnd w:id="17"/>
-    </w:p>
-    <w:p>
-      <w:r>
-        <w:t>[</w:t>
-      </w:r>
-      <w:r>
-        <w:rPr>
-          <w:highlight w:val="yellow"/>
-        </w:rPr>
-        <w:t>Est-ce qu’il y a eu un gros changement entre l’idée initiale et le résultat? Si tu pouvais recommencer quelque chose, ce serait quoi?</w:t>
-      </w:r>
-      <w:r>
-        <w:rPr>
-          <w:highlight w:val="yellow"/>
-        </w:rPr>
-        <w:t>]</w:t>
-      </w:r>
-    </w:p>
-    <w:p>
-      <w:r>
-        <w:t>asd</w:t>
+      <w:bookmarkEnd w:id="20"/>
+    </w:p>
+    <w:p>
+      <w:r>
+        <w:t>Quelques fonctionnalités étaient manquantes finalement, soit l’</w:t>
+      </w:r>
+      <w:r>
+        <w:t>exécution</w:t>
+      </w:r>
+      <w:r>
+        <w:t xml:space="preserve"> de Batch files sans faire appel au CMD de Windows, l’utilisation du </w:t>
+      </w:r>
+      <w:r>
+        <w:t>lecteur</w:t>
+      </w:r>
+      <w:r>
+        <w:t xml:space="preserve"> carte SD pour stoker les informations voulus ainsi que le Keylogger. </w:t>
+      </w:r>
+    </w:p>
+    <w:p>
+      <w:r>
+        <w:t xml:space="preserve">La souris fonctionnait sans fil, mais ne pouvait pas faire </w:t>
+      </w:r>
+      <w:r>
+        <w:t>toutes les fonctionnalités voulues</w:t>
+      </w:r>
+      <w:r>
+        <w:t>, donc ça serait aussi un facteur à considérer pour la prochaine fois.</w:t>
+      </w:r>
+    </w:p>
+    <w:p/>
+    <w:p>
+      <w:r>
+        <w:t xml:space="preserve">Le concept général de la manette n’a pas </w:t>
+      </w:r>
+      <w:r>
+        <w:t>changé</w:t>
+      </w:r>
+      <w:r>
+        <w:t xml:space="preserve"> en cours de route. Seulement l’</w:t>
+      </w:r>
+      <w:r>
+        <w:t>exécution</w:t>
+      </w:r>
+      <w:r>
+        <w:t xml:space="preserve"> de </w:t>
+      </w:r>
+      <w:r>
+        <w:t>certains concepts</w:t>
+      </w:r>
+      <w:r>
+        <w:t xml:space="preserve">, </w:t>
+      </w:r>
+      <w:r>
+        <w:t>comme</w:t>
+      </w:r>
+      <w:r>
+        <w:t xml:space="preserve"> l’</w:t>
+      </w:r>
+      <w:r>
+        <w:t>exécution</w:t>
+      </w:r>
+      <w:r>
+        <w:t xml:space="preserve"> de batch files, n’était pas à la hauteur de nos attentes.</w:t>
+      </w:r>
+    </w:p>
+    <w:p/>
+    <w:p>
+      <w:r>
+        <w:t xml:space="preserve">L’utilisation d’un </w:t>
+      </w:r>
+      <w:r>
+        <w:t>microcontrôleur</w:t>
+      </w:r>
+      <w:r>
+        <w:t xml:space="preserve"> plus complet, soit avec un cr</w:t>
+      </w:r>
+      <w:r>
+        <w:t>i</w:t>
+      </w:r>
+      <w:r>
+        <w:t xml:space="preserve">stal et un flash intégré, aurait pu grandement simplifier la conception d’un produit comme celui de l’équipe, sans trop augmenter le prix du produit (Si le prix </w:t>
+      </w:r>
+      <w:r>
+        <w:t>n’était</w:t>
+      </w:r>
+      <w:r>
+        <w:t xml:space="preserve"> pas encore plus bas que le prix du S3R8 + composantes externes). </w:t>
+      </w:r>
+      <w:r>
+        <w:t>Les fonctionnalités mentionnées</w:t>
+      </w:r>
+      <w:r>
+        <w:t xml:space="preserve"> ci-haut serait aussi un facteur important pour une V2 du produit.</w:t>
       </w:r>
     </w:p>
     <w:p>
@@ -3305,7 +3755,7 @@
         <w:br w:type="page"/>
       </w:r>
     </w:p>
-    <w:bookmarkStart w:id="18" w:name="_Toc174639059" w:displacedByCustomXml="next"/>
+    <w:bookmarkStart w:id="21" w:name="_Toc174639059" w:displacedByCustomXml="next"/>
     <w:sdt>
       <w:sdtPr>
         <w:rPr>
@@ -3322,12 +3772,12 @@
       <w:sdtContent>
         <w:p>
           <w:pPr>
-            <w:pStyle w:val="Heading1"/>
+            <w:pStyle w:val="Titre1"/>
           </w:pPr>
           <w:r>
             <w:t>Références</w:t>
           </w:r>
-          <w:bookmarkEnd w:id="18"/>
+          <w:bookmarkEnd w:id="21"/>
         </w:p>
         <w:sdt>
           <w:sdtPr>
@@ -3336,11 +3786,6 @@
           </w:sdtPr>
           <w:sdtContent>
             <w:p>
-              <w:pPr>
-                <w:rPr>
-                  <w:lang w:val="en-CA"/>
-                </w:rPr>
-              </w:pPr>
               <w:r>
                 <w:fldChar w:fldCharType="begin"/>
               </w:r>
@@ -3353,15 +3798,145 @@
               <w:r>
                 <w:fldChar w:fldCharType="separate"/>
               </w:r>
-              <w:r>
+            </w:p>
+            <w:tbl>
+              <w:tblPr>
+                <w:tblW w:w="5000" w:type="pct"/>
+                <w:tblCellSpacing w:w="15" w:type="dxa"/>
+                <w:tblCellMar>
+                  <w:top w:w="15" w:type="dxa"/>
+                  <w:left w:w="15" w:type="dxa"/>
+                  <w:bottom w:w="15" w:type="dxa"/>
+                  <w:right w:w="15" w:type="dxa"/>
+                </w:tblCellMar>
+                <w:tblLook w:val="04A0" w:firstRow="1" w:lastRow="0" w:firstColumn="1" w:lastColumn="0" w:noHBand="0" w:noVBand="1"/>
+              </w:tblPr>
+              <w:tblGrid>
+                <w:gridCol w:w="568"/>
+                <w:gridCol w:w="8792"/>
+              </w:tblGrid>
+              <w:tr>
+                <w:trPr>
+                  <w:divId w:val="360784045"/>
+                  <w:tblCellSpacing w:w="15" w:type="dxa"/>
+                </w:trPr>
+                <w:tc>
+                  <w:tcPr>
+                    <w:tcW w:w="279" w:type="pct"/>
+                    <w:hideMark/>
+                  </w:tcPr>
+                  <w:p>
+                    <w:pPr>
+                      <w:pStyle w:val="Bibliographie"/>
+                      <w:rPr>
+                        <w:noProof/>
+                        <w:sz w:val="24"/>
+                        <w:szCs w:val="24"/>
+                        <w:lang w:val="fr-CA"/>
+                      </w:rPr>
+                    </w:pPr>
+                    <w:r>
+                      <w:rPr>
+                        <w:noProof/>
+                        <w:sz w:val="24"/>
+                        <w:szCs w:val="24"/>
+                        <w:lang w:val="fr-CA"/>
+                      </w:rPr>
+                      <w:t>[</w:t>
+                    </w:r>
+                    <w:r>
+                      <w:rPr>
+                        <w:noProof/>
+                        <w:sz w:val="24"/>
+                        <w:szCs w:val="24"/>
+                        <w:lang w:val="fr-CA"/>
+                      </w:rPr>
+                      <w:t>1</w:t>
+                    </w:r>
+                    <w:r>
+                      <w:rPr>
+                        <w:noProof/>
+                        <w:sz w:val="24"/>
+                        <w:szCs w:val="24"/>
+                        <w:lang w:val="fr-CA"/>
+                      </w:rPr>
+                      <w:t xml:space="preserve">] </w:t>
+                    </w:r>
+                  </w:p>
+                </w:tc>
+                <w:tc>
+                  <w:tcPr>
+                    <w:tcW w:w="4673" w:type="pct"/>
+                    <w:hideMark/>
+                  </w:tcPr>
+                  <w:p>
+                    <w:pPr>
+                      <w:pStyle w:val="Bibliographie"/>
+                      <w:rPr>
+                        <w:noProof/>
+                        <w:sz w:val="24"/>
+                        <w:szCs w:val="24"/>
+                        <w:lang w:val="fr-CA"/>
+                      </w:rPr>
+                    </w:pPr>
+                    <w:r>
+                      <w:rPr>
+                        <w:noProof/>
+                        <w:sz w:val="24"/>
+                        <w:szCs w:val="24"/>
+                        <w:lang w:val="fr-CA"/>
+                      </w:rPr>
+                      <w:t>E. Systems, «</w:t>
+                    </w:r>
+                    <w:r>
+                      <w:rPr>
+                        <w:noProof/>
+                        <w:sz w:val="24"/>
+                        <w:szCs w:val="24"/>
+                        <w:lang w:val="fr-CA"/>
+                      </w:rPr>
+                      <w:t>ESP32-S3 Series Datasheet</w:t>
+                    </w:r>
+                    <w:r>
+                      <w:rPr>
+                        <w:noProof/>
+                        <w:sz w:val="24"/>
+                        <w:szCs w:val="24"/>
+                        <w:lang w:val="fr-CA"/>
+                      </w:rPr>
+                      <w:t xml:space="preserve">,» [En ligne]. Available: </w:t>
+                    </w:r>
+                    <w:r>
+                      <w:rPr>
+                        <w:noProof/>
+                        <w:sz w:val="24"/>
+                        <w:szCs w:val="24"/>
+                        <w:lang w:val="fr-CA"/>
+                      </w:rPr>
+                      <w:t>https://www.espressif.com/sites/default/files/documentation/esp32-s3_datasheet_en.pdf</w:t>
+                    </w:r>
+                    <w:r>
+                      <w:rPr>
+                        <w:noProof/>
+                        <w:sz w:val="24"/>
+                        <w:szCs w:val="24"/>
+                        <w:lang w:val="fr-CA"/>
+                      </w:rPr>
+                      <w:t>. [Accès le 18 08 2024].</w:t>
+                    </w:r>
+                  </w:p>
+                </w:tc>
+              </w:tr>
+            </w:tbl>
+            <w:p>
+              <w:pPr>
+                <w:divId w:val="360784045"/>
                 <w:rPr>
-                  <w:b/>
-                  <w:bCs/>
                   <w:noProof/>
-                  <w:lang w:val="en-US"/>
                 </w:rPr>
-                <w:t>There are no sources in the current document.</w:t>
-              </w:r>
+              </w:pPr>
+            </w:p>
+            <w:p>
               <w:r>
                 <w:rPr>
                   <w:b/>
@@ -3371,45 +3946,104 @@
                 <w:fldChar w:fldCharType="end"/>
               </w:r>
             </w:p>
+            <w:tbl>
+              <w:tblPr>
+                <w:tblW w:w="5000" w:type="pct"/>
+                <w:tblCellSpacing w:w="15" w:type="dxa"/>
+                <w:tblCellMar>
+                  <w:top w:w="15" w:type="dxa"/>
+                  <w:left w:w="15" w:type="dxa"/>
+                  <w:bottom w:w="15" w:type="dxa"/>
+                  <w:right w:w="15" w:type="dxa"/>
+                </w:tblCellMar>
+                <w:tblLook w:val="04A0" w:firstRow="1" w:lastRow="0" w:firstColumn="1" w:lastColumn="0" w:noHBand="0" w:noVBand="1"/>
+              </w:tblPr>
+              <w:tblGrid>
+                <w:gridCol w:w="568"/>
+                <w:gridCol w:w="8792"/>
+              </w:tblGrid>
+              <w:tr>
+                <w:trPr>
+                  <w:tblCellSpacing w:w="15" w:type="dxa"/>
+                </w:trPr>
+                <w:tc>
+                  <w:tcPr>
+                    <w:tcW w:w="279" w:type="pct"/>
+                    <w:hideMark/>
+                  </w:tcPr>
+                  <w:p>
+                    <w:pPr>
+                      <w:pStyle w:val="Bibliographie"/>
+                      <w:rPr>
+                        <w:noProof/>
+                        <w:sz w:val="24"/>
+                        <w:szCs w:val="24"/>
+                        <w:lang w:val="fr-CA"/>
+                      </w:rPr>
+                    </w:pPr>
+                    <w:r>
+                      <w:rPr>
+                        <w:noProof/>
+                        <w:sz w:val="24"/>
+                        <w:szCs w:val="24"/>
+                        <w:lang w:val="fr-CA"/>
+                      </w:rPr>
+                      <w:t xml:space="preserve">[2] </w:t>
+                    </w:r>
+                  </w:p>
+                </w:tc>
+                <w:tc>
+                  <w:tcPr>
+                    <w:tcW w:w="4673" w:type="pct"/>
+                    <w:hideMark/>
+                  </w:tcPr>
+                  <w:p>
+                    <w:pPr>
+                      <w:pStyle w:val="Bibliographie"/>
+                      <w:rPr>
+                        <w:noProof/>
+                        <w:sz w:val="24"/>
+                        <w:szCs w:val="24"/>
+                        <w:lang w:val="fr-CA"/>
+                      </w:rPr>
+                    </w:pPr>
+                    <w:r>
+                      <w:rPr>
+                        <w:noProof/>
+                        <w:sz w:val="24"/>
+                        <w:szCs w:val="24"/>
+                        <w:lang w:val="fr-CA"/>
+                      </w:rPr>
+                      <w:t>E. Systems, «ESP Hardware Design Guidelines,» [En ligne]. Available: https://docs.espressif.com/projects/esp-hardware-design-guidelines/en/latest/esp32s3/index.html. [Accès le 18 08 2024].</w:t>
+                    </w:r>
+                  </w:p>
+                </w:tc>
+              </w:tr>
+            </w:tbl>
+            <w:p>
+              <w:pPr>
+                <w:rPr>
+                  <w:lang w:val="en-CA"/>
+                </w:rPr>
+              </w:pPr>
+            </w:p>
           </w:sdtContent>
         </w:sdt>
       </w:sdtContent>
     </w:sdt>
     <w:p>
       <w:pPr>
-        <w:rPr>
-          <w:lang w:val="en-CA"/>
-        </w:rPr>
-      </w:pPr>
-    </w:p>
-    <w:p>
-      <w:pPr>
         <w:spacing w:after="160" w:line="259" w:lineRule="auto"/>
         <w:jc w:val="left"/>
       </w:pPr>
-      <w:r>
-        <w:t>[Oubliez pas les références!]</w:t>
-      </w:r>
-    </w:p>
-    <w:p>
-      <w:pPr>
-        <w:spacing w:after="160" w:line="259" w:lineRule="auto"/>
-        <w:jc w:val="left"/>
-      </w:pPr>
-    </w:p>
-    <w:p>
-      <w:pPr>
-        <w:spacing w:after="160" w:line="259" w:lineRule="auto"/>
-        <w:jc w:val="left"/>
-      </w:pPr>
     </w:p>
     <w:sectPr>
-      <w:headerReference w:type="even" r:id="rId13"/>
-      <w:headerReference w:type="default" r:id="rId14"/>
-      <w:footerReference w:type="even" r:id="rId15"/>
-      <w:footerReference w:type="default" r:id="rId16"/>
-      <w:headerReference w:type="first" r:id="rId17"/>
-      <w:footerReference w:type="first" r:id="rId18"/>
+      <w:headerReference w:type="even" r:id="rId14"/>
+      <w:headerReference w:type="default" r:id="rId15"/>
+      <w:footerReference w:type="even" r:id="rId16"/>
+      <w:footerReference w:type="default" r:id="rId17"/>
+      <w:headerReference w:type="first" r:id="rId18"/>
+      <w:footerReference w:type="first" r:id="rId19"/>
       <w:pgSz w:w="12240" w:h="15840"/>
       <w:pgMar w:top="1440" w:right="1440" w:bottom="1440" w:left="1440" w:header="708" w:footer="708" w:gutter="0"/>
       <w:cols w:space="708"/>
@@ -3443,7 +4077,7 @@
 <w:ftr xmlns:wpc="http://schemas.microsoft.com/office/word/2010/wordprocessingCanvas" xmlns:cx="http://schemas.microsoft.com/office/drawing/2014/chartex" xmlns:cx1="http://schemas.microsoft.com/office/drawing/2015/9/8/chartex" xmlns:cx2="http://schemas.microsoft.com/office/drawing/2015/10/21/chartex" xmlns:cx3="http://schemas.microsoft.com/office/drawing/2016/5/9/chartex" xmlns:cx4="http://schemas.microsoft.com/office/drawing/2016/5/10/chartex" xmlns:cx5="http://schemas.microsoft.com/office/drawing/2016/5/11/chartex" xmlns:cx6="http://schemas.microsoft.com/office/drawing/2016/5/12/chartex" xmlns:cx7="http://schemas.microsoft.com/office/drawing/2016/5/13/chartex" xmlns:cx8="http://schemas.microsoft.com/office/drawing/2016/5/14/chartex" xmlns:mc="http://schemas.openxmlformats.org/markup-compatibility/2006" xmlns:aink="http://schemas.microsoft.com/office/drawing/2016/ink" xmlns:am3d="http://schemas.microsoft.com/office/drawing/2017/model3d" xmlns:o="urn:schemas-microsoft-com:office:office" xmlns:oel="http://schemas.microsoft.com/office/2019/extlst" xmlns:r="http://schemas.openxmlformats.org/officeDocument/2006/relationships" xmlns:m="http://schemas.openxmlformats.org/officeDocument/2006/math" xmlns:v="urn:schemas-microsoft-com:vml" xmlns:wp14="http://schemas.microsoft.com/office/word/2010/wordprocessingDrawing" xmlns:wp="http://schemas.openxmlformats.org/drawingml/2006/wordprocessingDrawing" xmlns:w10="urn:schemas-microsoft-com:office:word" xmlns:w="http://schemas.openxmlformats.org/wordprocessingml/2006/main" xmlns:w14="http://schemas.microsoft.com/office/word/2010/wordml" xmlns:w15="http://schemas.microsoft.com/office/word/2012/wordml" xmlns:w16cex="http://schemas.microsoft.com/office/word/2018/wordml/cex" xmlns:w16cid="http://schemas.microsoft.com/office/word/2016/wordml/cid" xmlns:w16="http://schemas.microsoft.com/office/word/2018/wordml" xmlns:w16du="http://schemas.microsoft.com/office/word/2023/wordml/word16du" xmlns:w16sdtdh="http://schemas.microsoft.com/office/word/2020/wordml/sdtdatahash" xmlns:w16se="http://schemas.microsoft.com/office/word/2015/wordml/symex" xmlns:wpg="http://schemas.microsoft.com/office/word/2010/wordprocessingGroup" xmlns:wpi="http://schemas.microsoft.com/office/word/2010/wordprocessingInk" xmlns:wne="http://schemas.microsoft.com/office/word/2006/wordml" xmlns:wps="http://schemas.microsoft.com/office/word/2010/wordprocessingShape" mc:Ignorable="w14 w15 w16se w16cid w16 w16cex w16sdtdh w16du wp14">
   <w:p>
     <w:pPr>
-      <w:pStyle w:val="Footer"/>
+      <w:pStyle w:val="Pieddepage"/>
     </w:pPr>
   </w:p>
 </w:ftr>
@@ -3453,7 +4087,7 @@
 <w:ftr xmlns:wpc="http://schemas.microsoft.com/office/word/2010/wordprocessingCanvas" xmlns:cx="http://schemas.microsoft.com/office/drawing/2014/chartex" xmlns:cx1="http://schemas.microsoft.com/office/drawing/2015/9/8/chartex" xmlns:cx2="http://schemas.microsoft.com/office/drawing/2015/10/21/chartex" xmlns:cx3="http://schemas.microsoft.com/office/drawing/2016/5/9/chartex" xmlns:cx4="http://schemas.microsoft.com/office/drawing/2016/5/10/chartex" xmlns:cx5="http://schemas.microsoft.com/office/drawing/2016/5/11/chartex" xmlns:cx6="http://schemas.microsoft.com/office/drawing/2016/5/12/chartex" xmlns:cx7="http://schemas.microsoft.com/office/drawing/2016/5/13/chartex" xmlns:cx8="http://schemas.microsoft.com/office/drawing/2016/5/14/chartex" xmlns:mc="http://schemas.openxmlformats.org/markup-compatibility/2006" xmlns:aink="http://schemas.microsoft.com/office/drawing/2016/ink" xmlns:am3d="http://schemas.microsoft.com/office/drawing/2017/model3d" xmlns:o="urn:schemas-microsoft-com:office:office" xmlns:oel="http://schemas.microsoft.com/office/2019/extlst" xmlns:r="http://schemas.openxmlformats.org/officeDocument/2006/relationships" xmlns:m="http://schemas.openxmlformats.org/officeDocument/2006/math" xmlns:v="urn:schemas-microsoft-com:vml" xmlns:wp14="http://schemas.microsoft.com/office/word/2010/wordprocessingDrawing" xmlns:wp="http://schemas.openxmlformats.org/drawingml/2006/wordprocessingDrawing" xmlns:w10="urn:schemas-microsoft-com:office:word" xmlns:w="http://schemas.openxmlformats.org/wordprocessingml/2006/main" xmlns:w14="http://schemas.microsoft.com/office/word/2010/wordml" xmlns:w15="http://schemas.microsoft.com/office/word/2012/wordml" xmlns:w16cex="http://schemas.microsoft.com/office/word/2018/wordml/cex" xmlns:w16cid="http://schemas.microsoft.com/office/word/2016/wordml/cid" xmlns:w16="http://schemas.microsoft.com/office/word/2018/wordml" xmlns:w16du="http://schemas.microsoft.com/office/word/2023/wordml/word16du" xmlns:w16sdtdh="http://schemas.microsoft.com/office/word/2020/wordml/sdtdatahash" xmlns:w16se="http://schemas.microsoft.com/office/word/2015/wordml/symex" xmlns:wpg="http://schemas.microsoft.com/office/word/2010/wordprocessingGroup" xmlns:wpi="http://schemas.microsoft.com/office/word/2010/wordprocessingInk" xmlns:wne="http://schemas.microsoft.com/office/word/2006/wordml" xmlns:wps="http://schemas.microsoft.com/office/word/2010/wordprocessingShape" mc:Ignorable="w14 w15 w16se w16cid w16 w16cex w16sdtdh w16du wp14">
   <w:p>
     <w:pPr>
-      <w:pStyle w:val="Footer"/>
+      <w:pStyle w:val="Pieddepage"/>
     </w:pPr>
     <w:r>
       <w:rPr>
@@ -3700,7 +4334,7 @@
                         <w:txbxContent>
                           <w:tbl>
                             <w:tblPr>
-                              <w:tblStyle w:val="TableGrid"/>
+                              <w:tblStyle w:val="Grilledutableau"/>
                               <w:tblW w:w="0" w:type="auto"/>
                               <w:tblBorders>
                                 <w:top w:val="none" w:sz="0" w:space="0" w:color="auto"/>
@@ -3735,7 +4369,7 @@
                                     </w:r>
                                     <w:r>
                                       <w:rPr>
-                                        <w:rStyle w:val="PlaceholderText"/>
+                                        <w:rStyle w:val="Textedelespacerserv"/>
                                         <w:rFonts w:eastAsiaTheme="minorHAnsi"/>
                                         <w:noProof/>
                                       </w:rPr>
@@ -3837,7 +4471,7 @@
                   <w:txbxContent>
                     <w:tbl>
                       <w:tblPr>
-                        <w:tblStyle w:val="TableGrid"/>
+                        <w:tblStyle w:val="Grilledutableau"/>
                         <w:tblW w:w="0" w:type="auto"/>
                         <w:tblBorders>
                           <w:top w:val="none" w:sz="0" w:space="0" w:color="auto"/>
@@ -3872,7 +4506,7 @@
                               </w:r>
                               <w:r>
                                 <w:rPr>
-                                  <w:rStyle w:val="PlaceholderText"/>
+                                  <w:rStyle w:val="Textedelespacerserv"/>
                                   <w:rFonts w:eastAsiaTheme="minorHAnsi"/>
                                   <w:noProof/>
                                 </w:rPr>
@@ -3960,7 +4594,7 @@
 <w:ftr xmlns:wpc="http://schemas.microsoft.com/office/word/2010/wordprocessingCanvas" xmlns:cx="http://schemas.microsoft.com/office/drawing/2014/chartex" xmlns:cx1="http://schemas.microsoft.com/office/drawing/2015/9/8/chartex" xmlns:cx2="http://schemas.microsoft.com/office/drawing/2015/10/21/chartex" xmlns:cx3="http://schemas.microsoft.com/office/drawing/2016/5/9/chartex" xmlns:cx4="http://schemas.microsoft.com/office/drawing/2016/5/10/chartex" xmlns:cx5="http://schemas.microsoft.com/office/drawing/2016/5/11/chartex" xmlns:cx6="http://schemas.microsoft.com/office/drawing/2016/5/12/chartex" xmlns:cx7="http://schemas.microsoft.com/office/drawing/2016/5/13/chartex" xmlns:cx8="http://schemas.microsoft.com/office/drawing/2016/5/14/chartex" xmlns:mc="http://schemas.openxmlformats.org/markup-compatibility/2006" xmlns:aink="http://schemas.microsoft.com/office/drawing/2016/ink" xmlns:am3d="http://schemas.microsoft.com/office/drawing/2017/model3d" xmlns:o="urn:schemas-microsoft-com:office:office" xmlns:oel="http://schemas.microsoft.com/office/2019/extlst" xmlns:r="http://schemas.openxmlformats.org/officeDocument/2006/relationships" xmlns:m="http://schemas.openxmlformats.org/officeDocument/2006/math" xmlns:v="urn:schemas-microsoft-com:vml" xmlns:wp14="http://schemas.microsoft.com/office/word/2010/wordprocessingDrawing" xmlns:wp="http://schemas.openxmlformats.org/drawingml/2006/wordprocessingDrawing" xmlns:w10="urn:schemas-microsoft-com:office:word" xmlns:w="http://schemas.openxmlformats.org/wordprocessingml/2006/main" xmlns:w14="http://schemas.microsoft.com/office/word/2010/wordml" xmlns:w15="http://schemas.microsoft.com/office/word/2012/wordml" xmlns:w16cex="http://schemas.microsoft.com/office/word/2018/wordml/cex" xmlns:w16cid="http://schemas.microsoft.com/office/word/2016/wordml/cid" xmlns:w16="http://schemas.microsoft.com/office/word/2018/wordml" xmlns:w16du="http://schemas.microsoft.com/office/word/2023/wordml/word16du" xmlns:w16sdtdh="http://schemas.microsoft.com/office/word/2020/wordml/sdtdatahash" xmlns:w16se="http://schemas.microsoft.com/office/word/2015/wordml/symex" xmlns:wpg="http://schemas.microsoft.com/office/word/2010/wordprocessingGroup" xmlns:wpi="http://schemas.microsoft.com/office/word/2010/wordprocessingInk" xmlns:wne="http://schemas.microsoft.com/office/word/2006/wordml" xmlns:wps="http://schemas.microsoft.com/office/word/2010/wordprocessingShape" mc:Ignorable="w14 w15 w16se w16cid w16 w16cex w16sdtdh w16du wp14">
   <w:p>
     <w:pPr>
-      <w:pStyle w:val="Footer"/>
+      <w:pStyle w:val="Pieddepage"/>
     </w:pPr>
     <w:r>
       <w:rPr>
@@ -4059,7 +4693,7 @@
 <w:hdr xmlns:wpc="http://schemas.microsoft.com/office/word/2010/wordprocessingCanvas" xmlns:cx="http://schemas.microsoft.com/office/drawing/2014/chartex" xmlns:cx1="http://schemas.microsoft.com/office/drawing/2015/9/8/chartex" xmlns:cx2="http://schemas.microsoft.com/office/drawing/2015/10/21/chartex" xmlns:cx3="http://schemas.microsoft.com/office/drawing/2016/5/9/chartex" xmlns:cx4="http://schemas.microsoft.com/office/drawing/2016/5/10/chartex" xmlns:cx5="http://schemas.microsoft.com/office/drawing/2016/5/11/chartex" xmlns:cx6="http://schemas.microsoft.com/office/drawing/2016/5/12/chartex" xmlns:cx7="http://schemas.microsoft.com/office/drawing/2016/5/13/chartex" xmlns:cx8="http://schemas.microsoft.com/office/drawing/2016/5/14/chartex" xmlns:mc="http://schemas.openxmlformats.org/markup-compatibility/2006" xmlns:aink="http://schemas.microsoft.com/office/drawing/2016/ink" xmlns:am3d="http://schemas.microsoft.com/office/drawing/2017/model3d" xmlns:o="urn:schemas-microsoft-com:office:office" xmlns:oel="http://schemas.microsoft.com/office/2019/extlst" xmlns:r="http://schemas.openxmlformats.org/officeDocument/2006/relationships" xmlns:m="http://schemas.openxmlformats.org/officeDocument/2006/math" xmlns:v="urn:schemas-microsoft-com:vml" xmlns:wp14="http://schemas.microsoft.com/office/word/2010/wordprocessingDrawing" xmlns:wp="http://schemas.openxmlformats.org/drawingml/2006/wordprocessingDrawing" xmlns:w10="urn:schemas-microsoft-com:office:word" xmlns:w="http://schemas.openxmlformats.org/wordprocessingml/2006/main" xmlns:w14="http://schemas.microsoft.com/office/word/2010/wordml" xmlns:w15="http://schemas.microsoft.com/office/word/2012/wordml" xmlns:w16cex="http://schemas.microsoft.com/office/word/2018/wordml/cex" xmlns:w16cid="http://schemas.microsoft.com/office/word/2016/wordml/cid" xmlns:w16="http://schemas.microsoft.com/office/word/2018/wordml" xmlns:w16du="http://schemas.microsoft.com/office/word/2023/wordml/word16du" xmlns:w16sdtdh="http://schemas.microsoft.com/office/word/2020/wordml/sdtdatahash" xmlns:w16se="http://schemas.microsoft.com/office/word/2015/wordml/symex" xmlns:wpg="http://schemas.microsoft.com/office/word/2010/wordprocessingGroup" xmlns:wpi="http://schemas.microsoft.com/office/word/2010/wordprocessingInk" xmlns:wne="http://schemas.microsoft.com/office/word/2006/wordml" xmlns:wps="http://schemas.microsoft.com/office/word/2010/wordprocessingShape" mc:Ignorable="w14 w15 w16se w16cid w16 w16cex w16sdtdh w16du wp14">
   <w:p>
     <w:pPr>
-      <w:pStyle w:val="Header"/>
+      <w:pStyle w:val="En-tte"/>
     </w:pPr>
   </w:p>
 </w:hdr>
@@ -4069,7 +4703,7 @@
 <w:hdr xmlns:wpc="http://schemas.microsoft.com/office/word/2010/wordprocessingCanvas" xmlns:cx="http://schemas.microsoft.com/office/drawing/2014/chartex" xmlns:cx1="http://schemas.microsoft.com/office/drawing/2015/9/8/chartex" xmlns:cx2="http://schemas.microsoft.com/office/drawing/2015/10/21/chartex" xmlns:cx3="http://schemas.microsoft.com/office/drawing/2016/5/9/chartex" xmlns:cx4="http://schemas.microsoft.com/office/drawing/2016/5/10/chartex" xmlns:cx5="http://schemas.microsoft.com/office/drawing/2016/5/11/chartex" xmlns:cx6="http://schemas.microsoft.com/office/drawing/2016/5/12/chartex" xmlns:cx7="http://schemas.microsoft.com/office/drawing/2016/5/13/chartex" xmlns:cx8="http://schemas.microsoft.com/office/drawing/2016/5/14/chartex" xmlns:mc="http://schemas.openxmlformats.org/markup-compatibility/2006" xmlns:aink="http://schemas.microsoft.com/office/drawing/2016/ink" xmlns:am3d="http://schemas.microsoft.com/office/drawing/2017/model3d" xmlns:o="urn:schemas-microsoft-com:office:office" xmlns:oel="http://schemas.microsoft.com/office/2019/extlst" xmlns:r="http://schemas.openxmlformats.org/officeDocument/2006/relationships" xmlns:m="http://schemas.openxmlformats.org/officeDocument/2006/math" xmlns:v="urn:schemas-microsoft-com:vml" xmlns:wp14="http://schemas.microsoft.com/office/word/2010/wordprocessingDrawing" xmlns:wp="http://schemas.openxmlformats.org/drawingml/2006/wordprocessingDrawing" xmlns:w10="urn:schemas-microsoft-com:office:word" xmlns:w="http://schemas.openxmlformats.org/wordprocessingml/2006/main" xmlns:w14="http://schemas.microsoft.com/office/word/2010/wordml" xmlns:w15="http://schemas.microsoft.com/office/word/2012/wordml" xmlns:w16cex="http://schemas.microsoft.com/office/word/2018/wordml/cex" xmlns:w16cid="http://schemas.microsoft.com/office/word/2016/wordml/cid" xmlns:w16="http://schemas.microsoft.com/office/word/2018/wordml" xmlns:w16du="http://schemas.microsoft.com/office/word/2023/wordml/word16du" xmlns:w16sdtdh="http://schemas.microsoft.com/office/word/2020/wordml/sdtdatahash" xmlns:w16se="http://schemas.microsoft.com/office/word/2015/wordml/symex" xmlns:wpg="http://schemas.microsoft.com/office/word/2010/wordprocessingGroup" xmlns:wpi="http://schemas.microsoft.com/office/word/2010/wordprocessingInk" xmlns:wne="http://schemas.microsoft.com/office/word/2006/wordml" xmlns:wps="http://schemas.microsoft.com/office/word/2010/wordprocessingShape" mc:Ignorable="w14 w15 w16se w16cid w16 w16cex w16sdtdh w16du wp14">
   <w:p>
     <w:pPr>
-      <w:pStyle w:val="Header"/>
+      <w:pStyle w:val="En-tte"/>
     </w:pPr>
     <w:r>
       <w:rPr>
@@ -4419,7 +5053,7 @@
 <w:hdr xmlns:wpc="http://schemas.microsoft.com/office/word/2010/wordprocessingCanvas" xmlns:cx="http://schemas.microsoft.com/office/drawing/2014/chartex" xmlns:cx1="http://schemas.microsoft.com/office/drawing/2015/9/8/chartex" xmlns:cx2="http://schemas.microsoft.com/office/drawing/2015/10/21/chartex" xmlns:cx3="http://schemas.microsoft.com/office/drawing/2016/5/9/chartex" xmlns:cx4="http://schemas.microsoft.com/office/drawing/2016/5/10/chartex" xmlns:cx5="http://schemas.microsoft.com/office/drawing/2016/5/11/chartex" xmlns:cx6="http://schemas.microsoft.com/office/drawing/2016/5/12/chartex" xmlns:cx7="http://schemas.microsoft.com/office/drawing/2016/5/13/chartex" xmlns:cx8="http://schemas.microsoft.com/office/drawing/2016/5/14/chartex" xmlns:mc="http://schemas.openxmlformats.org/markup-compatibility/2006" xmlns:aink="http://schemas.microsoft.com/office/drawing/2016/ink" xmlns:am3d="http://schemas.microsoft.com/office/drawing/2017/model3d" xmlns:o="urn:schemas-microsoft-com:office:office" xmlns:oel="http://schemas.microsoft.com/office/2019/extlst" xmlns:r="http://schemas.openxmlformats.org/officeDocument/2006/relationships" xmlns:m="http://schemas.openxmlformats.org/officeDocument/2006/math" xmlns:v="urn:schemas-microsoft-com:vml" xmlns:wp14="http://schemas.microsoft.com/office/word/2010/wordprocessingDrawing" xmlns:wp="http://schemas.openxmlformats.org/drawingml/2006/wordprocessingDrawing" xmlns:w10="urn:schemas-microsoft-com:office:word" xmlns:w="http://schemas.openxmlformats.org/wordprocessingml/2006/main" xmlns:w14="http://schemas.microsoft.com/office/word/2010/wordml" xmlns:w15="http://schemas.microsoft.com/office/word/2012/wordml" xmlns:w16cex="http://schemas.microsoft.com/office/word/2018/wordml/cex" xmlns:w16cid="http://schemas.microsoft.com/office/word/2016/wordml/cid" xmlns:w16="http://schemas.microsoft.com/office/word/2018/wordml" xmlns:w16du="http://schemas.microsoft.com/office/word/2023/wordml/word16du" xmlns:w16sdtdh="http://schemas.microsoft.com/office/word/2020/wordml/sdtdatahash" xmlns:w16se="http://schemas.microsoft.com/office/word/2015/wordml/symex" xmlns:wpg="http://schemas.microsoft.com/office/word/2010/wordprocessingGroup" xmlns:wpi="http://schemas.microsoft.com/office/word/2010/wordprocessingInk" xmlns:wne="http://schemas.microsoft.com/office/word/2006/wordml" xmlns:wps="http://schemas.microsoft.com/office/word/2010/wordprocessingShape" mc:Ignorable="w14 w15 w16se w16cid w16 w16cex w16sdtdh w16du wp14">
   <w:p>
     <w:pPr>
-      <w:pStyle w:val="Header"/>
+      <w:pStyle w:val="En-tte"/>
     </w:pPr>
   </w:p>
 </w:hdr>
@@ -4653,13 +5287,126 @@
     </w:lvl>
   </w:abstractNum>
   <w:abstractNum w:abstractNumId="2" w15:restartNumberingAfterBreak="0">
+    <w:nsid w:val="433B7D98"/>
+    <w:multiLevelType w:val="hybridMultilevel"/>
+    <w:tmpl w:val="989E5E46"/>
+    <w:lvl w:ilvl="0" w:tplc="01BA88CC">
+      <w:start w:val="5"/>
+      <w:numFmt w:val="bullet"/>
+      <w:lvlText w:val="-"/>
+      <w:lvlJc w:val="left"/>
+      <w:pPr>
+        <w:ind w:left="720" w:hanging="360"/>
+      </w:pPr>
+      <w:rPr>
+        <w:rFonts w:ascii="Amasis MT Pro" w:eastAsia="Times New Roman" w:hAnsi="Amasis MT Pro" w:cs="Times New Roman" w:hint="default"/>
+      </w:rPr>
+    </w:lvl>
+    <w:lvl w:ilvl="1" w:tplc="10090003" w:tentative="1">
+      <w:start w:val="1"/>
+      <w:numFmt w:val="bullet"/>
+      <w:lvlText w:val="o"/>
+      <w:lvlJc w:val="left"/>
+      <w:pPr>
+        <w:ind w:left="1440" w:hanging="360"/>
+      </w:pPr>
+      <w:rPr>
+        <w:rFonts w:ascii="Courier New" w:hAnsi="Courier New" w:cs="Courier New" w:hint="default"/>
+      </w:rPr>
+    </w:lvl>
+    <w:lvl w:ilvl="2" w:tplc="10090005" w:tentative="1">
+      <w:start w:val="1"/>
+      <w:numFmt w:val="bullet"/>
+      <w:lvlText w:val=""/>
+      <w:lvlJc w:val="left"/>
+      <w:pPr>
+        <w:ind w:left="2160" w:hanging="360"/>
+      </w:pPr>
+      <w:rPr>
+        <w:rFonts w:ascii="Wingdings" w:hAnsi="Wingdings" w:hint="default"/>
+      </w:rPr>
+    </w:lvl>
+    <w:lvl w:ilvl="3" w:tplc="10090001" w:tentative="1">
+      <w:start w:val="1"/>
+      <w:numFmt w:val="bullet"/>
+      <w:lvlText w:val=""/>
+      <w:lvlJc w:val="left"/>
+      <w:pPr>
+        <w:ind w:left="2880" w:hanging="360"/>
+      </w:pPr>
+      <w:rPr>
+        <w:rFonts w:ascii="Symbol" w:hAnsi="Symbol" w:hint="default"/>
+      </w:rPr>
+    </w:lvl>
+    <w:lvl w:ilvl="4" w:tplc="10090003" w:tentative="1">
+      <w:start w:val="1"/>
+      <w:numFmt w:val="bullet"/>
+      <w:lvlText w:val="o"/>
+      <w:lvlJc w:val="left"/>
+      <w:pPr>
+        <w:ind w:left="3600" w:hanging="360"/>
+      </w:pPr>
+      <w:rPr>
+        <w:rFonts w:ascii="Courier New" w:hAnsi="Courier New" w:cs="Courier New" w:hint="default"/>
+      </w:rPr>
+    </w:lvl>
+    <w:lvl w:ilvl="5" w:tplc="10090005" w:tentative="1">
+      <w:start w:val="1"/>
+      <w:numFmt w:val="bullet"/>
+      <w:lvlText w:val=""/>
+      <w:lvlJc w:val="left"/>
+      <w:pPr>
+        <w:ind w:left="4320" w:hanging="360"/>
+      </w:pPr>
+      <w:rPr>
+        <w:rFonts w:ascii="Wingdings" w:hAnsi="Wingdings" w:hint="default"/>
+      </w:rPr>
+    </w:lvl>
+    <w:lvl w:ilvl="6" w:tplc="10090001" w:tentative="1">
+      <w:start w:val="1"/>
+      <w:numFmt w:val="bullet"/>
+      <w:lvlText w:val=""/>
+      <w:lvlJc w:val="left"/>
+      <w:pPr>
+        <w:ind w:left="5040" w:hanging="360"/>
+      </w:pPr>
+      <w:rPr>
+        <w:rFonts w:ascii="Symbol" w:hAnsi="Symbol" w:hint="default"/>
+      </w:rPr>
+    </w:lvl>
+    <w:lvl w:ilvl="7" w:tplc="10090003" w:tentative="1">
+      <w:start w:val="1"/>
+      <w:numFmt w:val="bullet"/>
+      <w:lvlText w:val="o"/>
+      <w:lvlJc w:val="left"/>
+      <w:pPr>
+        <w:ind w:left="5760" w:hanging="360"/>
+      </w:pPr>
+      <w:rPr>
+        <w:rFonts w:ascii="Courier New" w:hAnsi="Courier New" w:cs="Courier New" w:hint="default"/>
+      </w:rPr>
+    </w:lvl>
+    <w:lvl w:ilvl="8" w:tplc="10090005" w:tentative="1">
+      <w:start w:val="1"/>
+      <w:numFmt w:val="bullet"/>
+      <w:lvlText w:val=""/>
+      <w:lvlJc w:val="left"/>
+      <w:pPr>
+        <w:ind w:left="6480" w:hanging="360"/>
+      </w:pPr>
+      <w:rPr>
+        <w:rFonts w:ascii="Wingdings" w:hAnsi="Wingdings" w:hint="default"/>
+      </w:rPr>
+    </w:lvl>
+  </w:abstractNum>
+  <w:abstractNum w:abstractNumId="3" w15:restartNumberingAfterBreak="0">
     <w:nsid w:val="602A71F8"/>
     <w:multiLevelType w:val="multilevel"/>
     <w:tmpl w:val="03F05148"/>
     <w:lvl w:ilvl="0">
       <w:start w:val="1"/>
       <w:numFmt w:val="decimal"/>
-      <w:pStyle w:val="Heading1"/>
+      <w:pStyle w:val="Titre1"/>
       <w:lvlText w:val="%1."/>
       <w:lvlJc w:val="left"/>
       <w:pPr>
@@ -4672,7 +5419,7 @@
     <w:lvl w:ilvl="1">
       <w:start w:val="1"/>
       <w:numFmt w:val="decimal"/>
-      <w:pStyle w:val="Heading2"/>
+      <w:pStyle w:val="Titre2"/>
       <w:isLgl/>
       <w:lvlText w:val="%1.%2."/>
       <w:lvlJc w:val="left"/>
@@ -4686,7 +5433,7 @@
     <w:lvl w:ilvl="2">
       <w:start w:val="1"/>
       <w:numFmt w:val="decimal"/>
-      <w:pStyle w:val="Heading3"/>
+      <w:pStyle w:val="Titre3"/>
       <w:isLgl/>
       <w:lvlText w:val="%1.%2.%3."/>
       <w:lvlJc w:val="left"/>
@@ -4776,7 +5523,7 @@
       </w:rPr>
     </w:lvl>
   </w:abstractNum>
-  <w:abstractNum w:abstractNumId="3" w15:restartNumberingAfterBreak="0">
+  <w:abstractNum w:abstractNumId="4" w15:restartNumberingAfterBreak="0">
     <w:nsid w:val="67D64896"/>
     <w:multiLevelType w:val="hybridMultilevel"/>
     <w:tmpl w:val="D89456C6"/>
@@ -4863,16 +5610,19 @@
     </w:lvl>
   </w:abstractNum>
   <w:num w:numId="1" w16cid:durableId="358748246">
-    <w:abstractNumId w:val="2"/>
+    <w:abstractNumId w:val="3"/>
   </w:num>
   <w:num w:numId="2" w16cid:durableId="945045151">
     <w:abstractNumId w:val="0"/>
   </w:num>
   <w:num w:numId="3" w16cid:durableId="1547718096">
-    <w:abstractNumId w:val="3"/>
+    <w:abstractNumId w:val="4"/>
   </w:num>
   <w:num w:numId="4" w16cid:durableId="762144450">
     <w:abstractNumId w:val="1"/>
+  </w:num>
+  <w:num w:numId="5" w16cid:durableId="1684093625">
+    <w:abstractNumId w:val="2"/>
   </w:num>
 </w:numbering>
 </file>
@@ -5277,7 +6027,7 @@
   <w:style w:type="paragraph" w:default="1" w:styleId="Normal">
     <w:name w:val="Normal"/>
     <w:qFormat/>
-    <w:rsid w:val="004206D3"/>
+    <w:rsid w:val="00F22DC7"/>
     <w:pPr>
       <w:spacing w:after="0" w:line="240" w:lineRule="auto"/>
       <w:jc w:val="both"/>
@@ -5291,11 +6041,11 @@
       <w14:ligatures w14:val="none"/>
     </w:rPr>
   </w:style>
-  <w:style w:type="paragraph" w:styleId="Heading1">
+  <w:style w:type="paragraph" w:styleId="Titre1">
     <w:name w:val="heading 1"/>
     <w:basedOn w:val="Normal"/>
     <w:next w:val="Normal"/>
-    <w:link w:val="Heading1Char"/>
+    <w:link w:val="Titre1Car"/>
     <w:uiPriority w:val="9"/>
     <w:qFormat/>
     <w:rsid w:val="00287995"/>
@@ -5314,11 +6064,11 @@
       <w:szCs w:val="32"/>
     </w:rPr>
   </w:style>
-  <w:style w:type="paragraph" w:styleId="Heading2">
+  <w:style w:type="paragraph" w:styleId="Titre2">
     <w:name w:val="heading 2"/>
-    <w:basedOn w:val="Heading1"/>
+    <w:basedOn w:val="Titre1"/>
     <w:next w:val="Normal"/>
-    <w:link w:val="Heading2Char"/>
+    <w:link w:val="Titre2Car"/>
     <w:uiPriority w:val="9"/>
     <w:unhideWhenUsed/>
     <w:qFormat/>
@@ -5334,11 +6084,11 @@
       <w:szCs w:val="28"/>
     </w:rPr>
   </w:style>
-  <w:style w:type="paragraph" w:styleId="Heading3">
+  <w:style w:type="paragraph" w:styleId="Titre3">
     <w:name w:val="heading 3"/>
-    <w:basedOn w:val="ListParagraph"/>
+    <w:basedOn w:val="Paragraphedeliste"/>
     <w:next w:val="Normal"/>
-    <w:link w:val="Heading3Char"/>
+    <w:link w:val="Titre3Car"/>
     <w:uiPriority w:val="9"/>
     <w:unhideWhenUsed/>
     <w:qFormat/>
@@ -5356,11 +6106,11 @@
       <w:szCs w:val="26"/>
     </w:rPr>
   </w:style>
-  <w:style w:type="paragraph" w:styleId="Heading4">
+  <w:style w:type="paragraph" w:styleId="Titre4">
     <w:name w:val="heading 4"/>
     <w:basedOn w:val="Normal"/>
     <w:next w:val="Normal"/>
-    <w:link w:val="Heading4Char"/>
+    <w:link w:val="Titre4Car"/>
     <w:uiPriority w:val="9"/>
     <w:unhideWhenUsed/>
     <w:qFormat/>
@@ -5372,11 +6122,11 @@
       <w:rFonts w:ascii="Amasis MT Pro Medium" w:hAnsi="Amasis MT Pro Medium"/>
     </w:rPr>
   </w:style>
-  <w:style w:type="paragraph" w:styleId="Heading5">
+  <w:style w:type="paragraph" w:styleId="Titre5">
     <w:name w:val="heading 5"/>
-    <w:basedOn w:val="Header"/>
+    <w:basedOn w:val="En-tte"/>
     <w:next w:val="Normal"/>
-    <w:link w:val="Heading5Char"/>
+    <w:link w:val="Titre5Car"/>
     <w:unhideWhenUsed/>
     <w:qFormat/>
     <w:rsid w:val="00E32C1A"/>
@@ -5393,13 +6143,13 @@
       <w:sz w:val="22"/>
     </w:rPr>
   </w:style>
-  <w:style w:type="character" w:default="1" w:styleId="DefaultParagraphFont">
+  <w:style w:type="character" w:default="1" w:styleId="Policepardfaut">
     <w:name w:val="Default Paragraph Font"/>
     <w:uiPriority w:val="1"/>
     <w:semiHidden/>
     <w:unhideWhenUsed/>
   </w:style>
-  <w:style w:type="table" w:default="1" w:styleId="TableNormal">
+  <w:style w:type="table" w:default="1" w:styleId="TableauNormal">
     <w:name w:val="Normal Table"/>
     <w:uiPriority w:val="99"/>
     <w:semiHidden/>
@@ -5414,16 +6164,16 @@
       </w:tblCellMar>
     </w:tblPr>
   </w:style>
-  <w:style w:type="numbering" w:default="1" w:styleId="NoList">
+  <w:style w:type="numbering" w:default="1" w:styleId="Aucuneliste">
     <w:name w:val="No List"/>
     <w:uiPriority w:val="99"/>
     <w:semiHidden/>
     <w:unhideWhenUsed/>
   </w:style>
-  <w:style w:type="paragraph" w:styleId="Header">
+  <w:style w:type="paragraph" w:styleId="En-tte">
     <w:name w:val="header"/>
     <w:basedOn w:val="Normal"/>
-    <w:link w:val="HeaderChar"/>
+    <w:link w:val="En-tteCar"/>
     <w:uiPriority w:val="99"/>
     <w:unhideWhenUsed/>
     <w:rsid w:val="00B347F0"/>
@@ -5434,17 +6184,17 @@
       </w:tabs>
     </w:pPr>
   </w:style>
-  <w:style w:type="character" w:customStyle="1" w:styleId="HeaderChar">
-    <w:name w:val="Header Char"/>
-    <w:basedOn w:val="DefaultParagraphFont"/>
-    <w:link w:val="Header"/>
+  <w:style w:type="character" w:customStyle="1" w:styleId="En-tteCar">
+    <w:name w:val="En-tête Car"/>
+    <w:basedOn w:val="Policepardfaut"/>
+    <w:link w:val="En-tte"/>
     <w:uiPriority w:val="99"/>
     <w:rsid w:val="00B347F0"/>
   </w:style>
-  <w:style w:type="paragraph" w:styleId="Footer">
+  <w:style w:type="paragraph" w:styleId="Pieddepage">
     <w:name w:val="footer"/>
     <w:basedOn w:val="Normal"/>
-    <w:link w:val="FooterChar"/>
+    <w:link w:val="PieddepageCar"/>
     <w:uiPriority w:val="99"/>
     <w:unhideWhenUsed/>
     <w:rsid w:val="00B347F0"/>
@@ -5455,16 +6205,16 @@
       </w:tabs>
     </w:pPr>
   </w:style>
-  <w:style w:type="character" w:customStyle="1" w:styleId="FooterChar">
-    <w:name w:val="Footer Char"/>
-    <w:basedOn w:val="DefaultParagraphFont"/>
-    <w:link w:val="Footer"/>
+  <w:style w:type="character" w:customStyle="1" w:styleId="PieddepageCar">
+    <w:name w:val="Pied de page Car"/>
+    <w:basedOn w:val="Policepardfaut"/>
+    <w:link w:val="Pieddepage"/>
     <w:uiPriority w:val="99"/>
     <w:rsid w:val="00B347F0"/>
   </w:style>
-  <w:style w:type="table" w:styleId="TableGrid">
+  <w:style w:type="table" w:styleId="Grilledutableau">
     <w:name w:val="Table Grid"/>
-    <w:basedOn w:val="TableNormal"/>
+    <w:basedOn w:val="TableauNormal"/>
     <w:uiPriority w:val="39"/>
     <w:rsid w:val="00B347F0"/>
     <w:pPr>
@@ -5481,9 +6231,9 @@
       </w:tblBorders>
     </w:tblPr>
   </w:style>
-  <w:style w:type="character" w:styleId="BookTitle">
+  <w:style w:type="character" w:styleId="Titredulivre">
     <w:name w:val="Book Title"/>
-    <w:basedOn w:val="DefaultParagraphFont"/>
+    <w:basedOn w:val="Policepardfaut"/>
     <w:uiPriority w:val="33"/>
     <w:qFormat/>
     <w:rsid w:val="00B347F0"/>
@@ -5496,9 +6246,9 @@
       <w:szCs w:val="72"/>
     </w:rPr>
   </w:style>
-  <w:style w:type="character" w:styleId="PlaceholderText">
+  <w:style w:type="character" w:styleId="Textedelespacerserv">
     <w:name w:val="Placeholder Text"/>
-    <w:basedOn w:val="DefaultParagraphFont"/>
+    <w:basedOn w:val="Policepardfaut"/>
     <w:uiPriority w:val="99"/>
     <w:semiHidden/>
     <w:rsid w:val="00B347F0"/>
@@ -5506,11 +6256,11 @@
       <w:color w:val="666666"/>
     </w:rPr>
   </w:style>
-  <w:style w:type="paragraph" w:styleId="Title">
+  <w:style w:type="paragraph" w:styleId="Titre">
     <w:name w:val="Title"/>
     <w:basedOn w:val="Normal"/>
     <w:next w:val="Normal"/>
-    <w:link w:val="TitleChar"/>
+    <w:link w:val="TitreCar"/>
     <w:uiPriority w:val="10"/>
     <w:qFormat/>
     <w:rsid w:val="00DA12B7"/>
@@ -5526,10 +6276,10 @@
       <w:szCs w:val="56"/>
     </w:rPr>
   </w:style>
-  <w:style w:type="character" w:customStyle="1" w:styleId="TitleChar">
-    <w:name w:val="Title Char"/>
-    <w:basedOn w:val="DefaultParagraphFont"/>
-    <w:link w:val="Title"/>
+  <w:style w:type="character" w:customStyle="1" w:styleId="TitreCar">
+    <w:name w:val="Titre Car"/>
+    <w:basedOn w:val="Policepardfaut"/>
+    <w:link w:val="Titre"/>
     <w:uiPriority w:val="10"/>
     <w:rsid w:val="00DA12B7"/>
     <w:rPr>
@@ -5542,10 +6292,10 @@
       <w14:ligatures w14:val="none"/>
     </w:rPr>
   </w:style>
-  <w:style w:type="character" w:customStyle="1" w:styleId="Heading1Char">
-    <w:name w:val="Heading 1 Char"/>
-    <w:basedOn w:val="DefaultParagraphFont"/>
-    <w:link w:val="Heading1"/>
+  <w:style w:type="character" w:customStyle="1" w:styleId="Titre1Car">
+    <w:name w:val="Titre 1 Car"/>
+    <w:basedOn w:val="Policepardfaut"/>
+    <w:link w:val="Titre1"/>
     <w:uiPriority w:val="9"/>
     <w:rsid w:val="00287995"/>
     <w:rPr>
@@ -5557,7 +6307,7 @@
       <w14:ligatures w14:val="none"/>
     </w:rPr>
   </w:style>
-  <w:style w:type="paragraph" w:styleId="ListParagraph">
+  <w:style w:type="paragraph" w:styleId="Paragraphedeliste">
     <w:name w:val="List Paragraph"/>
     <w:basedOn w:val="Normal"/>
     <w:uiPriority w:val="34"/>
@@ -5568,10 +6318,10 @@
       <w:contextualSpacing/>
     </w:pPr>
   </w:style>
-  <w:style w:type="character" w:customStyle="1" w:styleId="Heading2Char">
-    <w:name w:val="Heading 2 Char"/>
-    <w:basedOn w:val="DefaultParagraphFont"/>
-    <w:link w:val="Heading2"/>
+  <w:style w:type="character" w:customStyle="1" w:styleId="Titre2Car">
+    <w:name w:val="Titre 2 Car"/>
+    <w:basedOn w:val="Policepardfaut"/>
+    <w:link w:val="Titre2"/>
     <w:uiPriority w:val="9"/>
     <w:rsid w:val="00287995"/>
     <w:rPr>
@@ -5583,10 +6333,10 @@
       <w14:ligatures w14:val="none"/>
     </w:rPr>
   </w:style>
-  <w:style w:type="character" w:customStyle="1" w:styleId="Heading3Char">
-    <w:name w:val="Heading 3 Char"/>
-    <w:basedOn w:val="DefaultParagraphFont"/>
-    <w:link w:val="Heading3"/>
+  <w:style w:type="character" w:customStyle="1" w:styleId="Titre3Car">
+    <w:name w:val="Titre 3 Car"/>
+    <w:basedOn w:val="Policepardfaut"/>
+    <w:link w:val="Titre3"/>
     <w:uiPriority w:val="9"/>
     <w:rsid w:val="00287995"/>
     <w:rPr>
@@ -5598,10 +6348,10 @@
       <w14:ligatures w14:val="none"/>
     </w:rPr>
   </w:style>
-  <w:style w:type="character" w:customStyle="1" w:styleId="Heading4Char">
-    <w:name w:val="Heading 4 Char"/>
-    <w:basedOn w:val="DefaultParagraphFont"/>
-    <w:link w:val="Heading4"/>
+  <w:style w:type="character" w:customStyle="1" w:styleId="Titre4Car">
+    <w:name w:val="Titre 4 Car"/>
+    <w:basedOn w:val="Policepardfaut"/>
+    <w:link w:val="Titre4"/>
     <w:uiPriority w:val="9"/>
     <w:rsid w:val="00287995"/>
     <w:rPr>
@@ -5613,7 +6363,7 @@
       <w14:ligatures w14:val="none"/>
     </w:rPr>
   </w:style>
-  <w:style w:type="paragraph" w:styleId="TOC1">
+  <w:style w:type="paragraph" w:styleId="TM1">
     <w:name w:val="toc 1"/>
     <w:basedOn w:val="Normal"/>
     <w:next w:val="Normal"/>
@@ -5625,7 +6375,7 @@
       <w:spacing w:after="100"/>
     </w:pPr>
   </w:style>
-  <w:style w:type="paragraph" w:styleId="TOC2">
+  <w:style w:type="paragraph" w:styleId="TM2">
     <w:name w:val="toc 2"/>
     <w:basedOn w:val="Normal"/>
     <w:next w:val="Normal"/>
@@ -5638,7 +6388,7 @@
       <w:ind w:left="240"/>
     </w:pPr>
   </w:style>
-  <w:style w:type="paragraph" w:styleId="TOC3">
+  <w:style w:type="paragraph" w:styleId="TM3">
     <w:name w:val="toc 3"/>
     <w:basedOn w:val="Normal"/>
     <w:next w:val="Normal"/>
@@ -5651,9 +6401,9 @@
       <w:ind w:left="480"/>
     </w:pPr>
   </w:style>
-  <w:style w:type="character" w:styleId="Hyperlink">
+  <w:style w:type="character" w:styleId="Lienhypertexte">
     <w:name w:val="Hyperlink"/>
-    <w:basedOn w:val="DefaultParagraphFont"/>
+    <w:basedOn w:val="Policepardfaut"/>
     <w:uiPriority w:val="99"/>
     <w:unhideWhenUsed/>
     <w:rsid w:val="004206D3"/>
@@ -5662,9 +6412,9 @@
       <w:u w:val="single"/>
     </w:rPr>
   </w:style>
-  <w:style w:type="character" w:styleId="UnresolvedMention">
+  <w:style w:type="character" w:styleId="Mentionnonrsolue">
     <w:name w:val="Unresolved Mention"/>
-    <w:basedOn w:val="DefaultParagraphFont"/>
+    <w:basedOn w:val="Policepardfaut"/>
     <w:uiPriority w:val="99"/>
     <w:semiHidden/>
     <w:unhideWhenUsed/>
@@ -5674,12 +6424,11 @@
       <w:shd w:val="clear" w:color="auto" w:fill="E1DFDD"/>
     </w:rPr>
   </w:style>
-  <w:style w:type="paragraph" w:styleId="Bibliography">
+  <w:style w:type="paragraph" w:styleId="Bibliographie">
     <w:name w:val="Bibliography"/>
     <w:basedOn w:val="Normal"/>
     <w:next w:val="Normal"/>
     <w:uiPriority w:val="37"/>
-    <w:semiHidden/>
     <w:unhideWhenUsed/>
     <w:rsid w:val="004C2FA7"/>
     <w:pPr>
@@ -5695,10 +6444,10 @@
       <w14:ligatures w14:val="standardContextual"/>
     </w:rPr>
   </w:style>
-  <w:style w:type="character" w:customStyle="1" w:styleId="Heading5Char">
-    <w:name w:val="Heading 5 Char"/>
-    <w:basedOn w:val="DefaultParagraphFont"/>
-    <w:link w:val="Heading5"/>
+  <w:style w:type="character" w:customStyle="1" w:styleId="Titre5Car">
+    <w:name w:val="Titre 5 Car"/>
+    <w:basedOn w:val="Policepardfaut"/>
+    <w:link w:val="Titre5"/>
     <w:rsid w:val="00E32C1A"/>
     <w:rPr>
       <w:rFonts w:ascii="Amasis MT Pro Black" w:eastAsiaTheme="majorEastAsia" w:hAnsi="Amasis MT Pro Black" w:cstheme="majorBidi"/>
@@ -5711,7 +6460,7 @@
   </w:style>
   <w:style w:type="paragraph" w:customStyle="1" w:styleId="Annexe">
     <w:name w:val="Annexe"/>
-    <w:basedOn w:val="Heading1"/>
+    <w:basedOn w:val="Titre1"/>
     <w:next w:val="Normal"/>
     <w:link w:val="AnnexeChar"/>
     <w:qFormat/>
@@ -5728,7 +6477,7 @@
   </w:style>
   <w:style w:type="character" w:customStyle="1" w:styleId="AnnexeChar">
     <w:name w:val="Annexe Char"/>
-    <w:basedOn w:val="Heading1Char"/>
+    <w:basedOn w:val="Titre1Car"/>
     <w:link w:val="Annexe"/>
     <w:rsid w:val="00E32C1A"/>
     <w:rPr>
@@ -5738,6 +6487,25 @@
       <w:szCs w:val="32"/>
       <w:lang w:val="fr-CA"/>
       <w14:ligatures w14:val="none"/>
+    </w:rPr>
+  </w:style>
+  <w:style w:type="paragraph" w:styleId="Lgende">
+    <w:name w:val="caption"/>
+    <w:basedOn w:val="Normal"/>
+    <w:next w:val="Normal"/>
+    <w:uiPriority w:val="35"/>
+    <w:unhideWhenUsed/>
+    <w:qFormat/>
+    <w:rsid w:val="00D21BE2"/>
+    <w:pPr>
+      <w:spacing w:after="200"/>
+    </w:pPr>
+    <w:rPr>
+      <w:i/>
+      <w:iCs/>
+      <w:color w:val="44546A" w:themeColor="text2"/>
+      <w:sz w:val="18"/>
+      <w:szCs w:val="18"/>
     </w:rPr>
   </w:style>
 </w:styles>
@@ -6039,11 +6807,50 @@
 </file>
 
 <file path=customXml/item1.xml><?xml version="1.0" encoding="utf-8"?>
-<b:Sources xmlns:b="http://schemas.openxmlformats.org/officeDocument/2006/bibliography" xmlns="http://schemas.openxmlformats.org/officeDocument/2006/bibliography" SelectedStyle="\IEEE2006OfficeOnline.xsl" StyleName="IEEE" Version="2006"/>
+<b:Sources xmlns:b="http://schemas.openxmlformats.org/officeDocument/2006/bibliography" xmlns="http://schemas.openxmlformats.org/officeDocument/2006/bibliography" SelectedStyle="\IEEE2006OfficeOnline.xsl" StyleName="IEEE" Version="2006">
+  <b:Source>
+    <b:Tag>Esp23</b:Tag>
+    <b:SourceType>DocumentFromInternetSite</b:SourceType>
+    <b:Guid>{0127E644-88CA-44FA-906D-BAE3C3483BCD}</b:Guid>
+    <b:Author>
+      <b:Author>
+        <b:Corporate>Espressif Systems</b:Corporate>
+      </b:Author>
+    </b:Author>
+    <b:Title>ESP32-S3 Series Datasheet</b:Title>
+    <b:Year>2023</b:Year>
+    <b:YearAccessed>2024</b:YearAccessed>
+    <b:MonthAccessed>08</b:MonthAccessed>
+    <b:DayAccessed>18</b:DayAccessed>
+    <b:URL>https://www.espressif.com/sites/default/files/documentation/esp32-s3_datasheet_en.pdf</b:URL>
+    <b:RefOrder>1</b:RefOrder>
+  </b:Source>
+  <b:Source>
+    <b:Tag>Esp24</b:Tag>
+    <b:SourceType>DocumentFromInternetSite</b:SourceType>
+    <b:Guid>{680E8237-C92C-4822-8B6D-092AA983E626}</b:Guid>
+    <b:Author>
+      <b:Author>
+        <b:NameList>
+          <b:Person>
+            <b:Last>Systems</b:Last>
+            <b:First>Espressif</b:First>
+          </b:Person>
+        </b:NameList>
+      </b:Author>
+    </b:Author>
+    <b:Title>ESP Hardware Design Guidelines</b:Title>
+    <b:YearAccessed>2024</b:YearAccessed>
+    <b:MonthAccessed>08</b:MonthAccessed>
+    <b:DayAccessed>18</b:DayAccessed>
+    <b:URL>https://docs.espressif.com/projects/esp-hardware-design-guidelines/en/latest/esp32s3/index.html</b:URL>
+    <b:RefOrder>2</b:RefOrder>
+  </b:Source>
+</b:Sources>
 </file>
 
 <file path=customXml/itemProps1.xml><?xml version="1.0" encoding="utf-8"?>
-<ds:datastoreItem xmlns:ds="http://schemas.openxmlformats.org/officeDocument/2006/customXml" ds:itemID="{E5BAFAE7-CF30-492A-A222-1B4DA4FA3EB0}">
+<ds:datastoreItem xmlns:ds="http://schemas.openxmlformats.org/officeDocument/2006/customXml" ds:itemID="{49EE8D8E-8A0B-451F-AEAA-BD101C8EAB22}">
   <ds:schemaRefs>
     <ds:schemaRef ds:uri="http://schemas.openxmlformats.org/officeDocument/2006/bibliography"/>
   </ds:schemaRefs>

</xml_diff>